<commit_message>
feat: Add KlarMinTC-Regular-GenKiMerriMix font variant and supporting build assets, replacing KlarMin-Regular.ttf.
</commit_message>
<xml_diff>
--- a/測試排版文字.docx
+++ b/測試排版文字.docx
@@ -45,7 +45,19 @@
         <w:rPr>
           <w:rFonts w:ascii="KlarUDMin" w:eastAsia="KlarUDMin" w:hAnsi="KlarUDMin"/>
         </w:rPr>
-        <w:t>稻作品質評估中，我們通常採用 NIR spectroscopy、chalkiness detection 與 sensory evaluation 等多元方法。研究團隊針對 Japonica 與 Indica 品種進行系統性分析，涵蓋蛋白質、脂肪、澱粉等主要營養成分。品質指標包括：外觀（whiteness、transparency）、烹飪特性（viscosity、hardness）、風味評價（aroma、taste）。</w:t>
+        <w:t>稻</w:t>
+      </w:r>
+      <w:r>
+        <w:rPr>
+          <w:rFonts w:ascii="KlarUDMin" w:eastAsia="KlarUDMin" w:hAnsi="KlarUDMin" w:hint="eastAsia"/>
+        </w:rPr>
+        <w:t>米我是</w:t>
+      </w:r>
+      <w:r>
+        <w:rPr>
+          <w:rFonts w:ascii="KlarUDMin" w:eastAsia="KlarUDMin" w:hAnsi="KlarUDMin"/>
+        </w:rPr>
+        <w:t>品質評估中，我們通常採用 NIR spectroscopy、chalkiness detection 與 sensory evaluation 等多元方法。研究團隊針對 Japonica 與 Indica 品種進行系統性分析，涵蓋蛋白質、脂肪、澱粉等主要營養成分。品質指標包括：外觀（whiteness、transparency）、烹飪特性（viscosity、hardness）、風味評價（aroma、taste）。</w:t>
       </w:r>
     </w:p>
     <w:p>

</xml_diff>

<commit_message>
feat: Update main font to `v9-symbolfix.ttf` by normalizing Windows line spacing, rolling back oversized symbols, and archiving previous versions.
</commit_message>
<xml_diff>
--- a/測試排版文字.docx
+++ b/測試排版文字.docx
@@ -115,6 +115,1303 @@
           <w:rFonts w:ascii="KlarMinTC GenKiMerriMix PunctFi" w:eastAsia="KlarMinTC GenKiMerriMix PunctFi" w:hAnsi="KlarMinTC GenKiMerriMix PunctFi"/>
         </w:rPr>
       </w:pPr>
+      <w:r>
+        <w:rPr>
+          <w:rFonts w:ascii="KlarMinTC GenKiMerriMix PunctFi" w:eastAsia="KlarMinTC GenKiMerriMix PunctFi" w:hAnsi="KlarMinTC GenKiMerriMix PunctFi" w:hint="eastAsia"/>
+        </w:rPr>
+        <w:t>【中文段落】</w:t>
+      </w:r>
+    </w:p>
+    <w:p>
+      <w:pPr>
+        <w:spacing w:after="0" w:line="0" w:lineRule="atLeast"/>
+        <w:rPr>
+          <w:rFonts w:ascii="KlarMinTC GenKiMerriMix PunctFi" w:eastAsia="KlarMinTC GenKiMerriMix PunctFi" w:hAnsi="KlarMinTC GenKiMerriMix PunctFi"/>
+        </w:rPr>
+      </w:pPr>
+      <w:r>
+        <w:rPr>
+          <w:rFonts w:ascii="KlarMinTC GenKiMerriMix PunctFi" w:eastAsia="KlarMinTC GenKiMerriMix PunctFi" w:hAnsi="KlarMinTC GenKiMerriMix PunctFi" w:hint="eastAsia"/>
+        </w:rPr>
+        <w:t xml:space="preserve">這是一段繁體中文測試文字，用來觀察單行行距、上下裁切、標點位置與整體密度是否接近原始 BLZ UD 明朝或 </w:t>
+      </w:r>
+      <w:proofErr w:type="spellStart"/>
+      <w:r>
+        <w:rPr>
+          <w:rFonts w:ascii="KlarMinTC GenKiMerriMix PunctFi" w:eastAsia="KlarMinTC GenKiMerriMix PunctFi" w:hAnsi="KlarMinTC GenKiMerriMix PunctFi" w:hint="eastAsia"/>
+        </w:rPr>
+        <w:t>TRWUDMincho</w:t>
+      </w:r>
+      <w:proofErr w:type="spellEnd"/>
+      <w:r>
+        <w:rPr>
+          <w:rFonts w:ascii="KlarMinTC GenKiMerriMix PunctFi" w:eastAsia="KlarMinTC GenKiMerriMix PunctFi" w:hAnsi="KlarMinTC GenKiMerriMix PunctFi" w:hint="eastAsia"/>
+        </w:rPr>
+        <w:t>。若版面看起來</w:t>
+      </w:r>
+      <w:proofErr w:type="gramStart"/>
+      <w:r>
+        <w:rPr>
+          <w:rFonts w:ascii="KlarMinTC GenKiMerriMix PunctFi" w:eastAsia="KlarMinTC GenKiMerriMix PunctFi" w:hAnsi="KlarMinTC GenKiMerriMix PunctFi" w:hint="eastAsia"/>
+        </w:rPr>
+        <w:t>鬆</w:t>
+      </w:r>
+      <w:proofErr w:type="gramEnd"/>
+      <w:r>
+        <w:rPr>
+          <w:rFonts w:ascii="KlarMinTC GenKiMerriMix PunctFi" w:eastAsia="KlarMinTC GenKiMerriMix PunctFi" w:hAnsi="KlarMinTC GenKiMerriMix PunctFi" w:hint="eastAsia"/>
+        </w:rPr>
+        <w:t>、浮、空，通常代表 ascent / descent 或少數異常 glyph 仍在</w:t>
+      </w:r>
+      <w:proofErr w:type="gramStart"/>
+      <w:r>
+        <w:rPr>
+          <w:rFonts w:ascii="KlarMinTC GenKiMerriMix PunctFi" w:eastAsia="KlarMinTC GenKiMerriMix PunctFi" w:hAnsi="KlarMinTC GenKiMerriMix PunctFi" w:hint="eastAsia"/>
+        </w:rPr>
+        <w:t>撐高整行</w:t>
+      </w:r>
+      <w:proofErr w:type="gramEnd"/>
+      <w:r>
+        <w:rPr>
+          <w:rFonts w:ascii="KlarMinTC GenKiMerriMix PunctFi" w:eastAsia="KlarMinTC GenKiMerriMix PunctFi" w:hAnsi="KlarMinTC GenKiMerriMix PunctFi" w:hint="eastAsia"/>
+        </w:rPr>
+        <w:t>。</w:t>
+      </w:r>
+    </w:p>
+    <w:p>
+      <w:pPr>
+        <w:spacing w:after="0" w:line="0" w:lineRule="atLeast"/>
+        <w:rPr>
+          <w:rFonts w:ascii="KlarMinTC GenKiMerriMix PunctFi" w:eastAsia="KlarMinTC GenKiMerriMix PunctFi" w:hAnsi="KlarMinTC GenKiMerriMix PunctFi"/>
+        </w:rPr>
+      </w:pPr>
+    </w:p>
+    <w:p>
+      <w:pPr>
+        <w:spacing w:after="0" w:line="0" w:lineRule="atLeast"/>
+        <w:rPr>
+          <w:rFonts w:ascii="KlarMinTC GenKiMerriMix PunctFi" w:eastAsia="KlarMinTC GenKiMerriMix PunctFi" w:hAnsi="KlarMinTC GenKiMerriMix PunctFi"/>
+        </w:rPr>
+      </w:pPr>
+      <w:r>
+        <w:rPr>
+          <w:rFonts w:ascii="KlarMinTC GenKiMerriMix PunctFi" w:eastAsia="KlarMinTC GenKiMerriMix PunctFi" w:hAnsi="KlarMinTC GenKiMerriMix PunctFi" w:hint="eastAsia"/>
+        </w:rPr>
+        <w:t>【中英數混排】</w:t>
+      </w:r>
+    </w:p>
+    <w:p>
+      <w:pPr>
+        <w:spacing w:after="0" w:line="0" w:lineRule="atLeast"/>
+        <w:rPr>
+          <w:rFonts w:ascii="KlarMinTC GenKiMerriMix PunctFi" w:eastAsia="KlarMinTC GenKiMerriMix PunctFi" w:hAnsi="KlarMinTC GenKiMerriMix PunctFi"/>
+        </w:rPr>
+      </w:pPr>
+      <w:r>
+        <w:rPr>
+          <w:rFonts w:ascii="KlarMinTC GenKiMerriMix PunctFi" w:eastAsia="KlarMinTC GenKiMerriMix PunctFi" w:hAnsi="KlarMinTC GenKiMerriMix PunctFi" w:hint="eastAsia"/>
+        </w:rPr>
+        <w:t>版本 1.0 預定於 2026-03-25 建立候選版，建議使用 11 pt、12 pt、14 pt 比對內文，並觀察 URL、檔案路徑、Email、數字與標點在同一行中的穩定度。</w:t>
+      </w:r>
+    </w:p>
+    <w:p>
+      <w:pPr>
+        <w:spacing w:after="0" w:line="0" w:lineRule="atLeast"/>
+        <w:rPr>
+          <w:rFonts w:ascii="KlarMinTC GenKiMerriMix PunctFi" w:eastAsia="KlarMinTC GenKiMerriMix PunctFi" w:hAnsi="KlarMinTC GenKiMerriMix PunctFi"/>
+        </w:rPr>
+      </w:pPr>
+    </w:p>
+    <w:p>
+      <w:pPr>
+        <w:spacing w:after="0" w:line="0" w:lineRule="atLeast"/>
+        <w:rPr>
+          <w:rFonts w:ascii="KlarMinTC GenKiMerriMix PunctFi" w:eastAsia="KlarMinTC GenKiMerriMix PunctFi" w:hAnsi="KlarMinTC GenKiMerriMix PunctFi"/>
+        </w:rPr>
+      </w:pPr>
+      <w:r>
+        <w:rPr>
+          <w:rFonts w:ascii="KlarMinTC GenKiMerriMix PunctFi" w:eastAsia="KlarMinTC GenKiMerriMix PunctFi" w:hAnsi="KlarMinTC GenKiMerriMix PunctFi" w:hint="eastAsia"/>
+        </w:rPr>
+        <w:t>【路徑 / URL / Email】</w:t>
+      </w:r>
+    </w:p>
+    <w:p>
+      <w:pPr>
+        <w:spacing w:after="0" w:line="0" w:lineRule="atLeast"/>
+        <w:rPr>
+          <w:rFonts w:ascii="KlarMinTC GenKiMerriMix PunctFi" w:eastAsia="KlarMinTC GenKiMerriMix PunctFi" w:hAnsi="KlarMinTC GenKiMerriMix PunctFi"/>
+        </w:rPr>
+      </w:pPr>
+      <w:r>
+        <w:rPr>
+          <w:rFonts w:ascii="KlarMinTC GenKiMerriMix PunctFi" w:eastAsia="KlarMinTC GenKiMerriMix PunctFi" w:hAnsi="KlarMinTC GenKiMerriMix PunctFi"/>
+        </w:rPr>
+        <w:t>C:\Users\user\OneDrive\project\UDminchoModified</w:t>
+      </w:r>
+    </w:p>
+    <w:p>
+      <w:pPr>
+        <w:spacing w:after="0" w:line="0" w:lineRule="atLeast"/>
+        <w:rPr>
+          <w:rFonts w:ascii="KlarMinTC GenKiMerriMix PunctFi" w:eastAsia="KlarMinTC GenKiMerriMix PunctFi" w:hAnsi="KlarMinTC GenKiMerriMix PunctFi"/>
+        </w:rPr>
+      </w:pPr>
+      <w:r>
+        <w:rPr>
+          <w:rFonts w:ascii="KlarMinTC GenKiMerriMix PunctFi" w:eastAsia="KlarMinTC GenKiMerriMix PunctFi" w:hAnsi="KlarMinTC GenKiMerriMix PunctFi"/>
+        </w:rPr>
+        <w:t>https://example.com/KlarMinTC/test?version=1.0&amp;mode=layout</w:t>
+      </w:r>
+    </w:p>
+    <w:p>
+      <w:pPr>
+        <w:spacing w:after="0" w:line="0" w:lineRule="atLeast"/>
+        <w:rPr>
+          <w:rFonts w:ascii="KlarMinTC GenKiMerriMix PunctFi" w:eastAsia="KlarMinTC GenKiMerriMix PunctFi" w:hAnsi="KlarMinTC GenKiMerriMix PunctFi"/>
+        </w:rPr>
+      </w:pPr>
+      <w:r>
+        <w:rPr>
+          <w:rFonts w:ascii="KlarMinTC GenKiMerriMix PunctFi" w:eastAsia="KlarMinTC GenKiMerriMix PunctFi" w:hAnsi="KlarMinTC GenKiMerriMix PunctFi"/>
+        </w:rPr>
+        <w:t>klarmin-test@example.com</w:t>
+      </w:r>
+    </w:p>
+    <w:p>
+      <w:pPr>
+        <w:spacing w:after="0" w:line="0" w:lineRule="atLeast"/>
+        <w:rPr>
+          <w:rFonts w:ascii="KlarMinTC GenKiMerriMix PunctFi" w:eastAsia="KlarMinTC GenKiMerriMix PunctFi" w:hAnsi="KlarMinTC GenKiMerriMix PunctFi"/>
+        </w:rPr>
+      </w:pPr>
+    </w:p>
+    <w:p>
+      <w:pPr>
+        <w:spacing w:after="0" w:line="0" w:lineRule="atLeast"/>
+        <w:rPr>
+          <w:rFonts w:ascii="KlarMinTC GenKiMerriMix PunctFi" w:eastAsia="KlarMinTC GenKiMerriMix PunctFi" w:hAnsi="KlarMinTC GenKiMerriMix PunctFi"/>
+        </w:rPr>
+      </w:pPr>
+      <w:r>
+        <w:rPr>
+          <w:rFonts w:ascii="KlarMinTC GenKiMerriMix PunctFi" w:eastAsia="KlarMinTC GenKiMerriMix PunctFi" w:hAnsi="KlarMinTC GenKiMerriMix PunctFi" w:hint="eastAsia"/>
+        </w:rPr>
+        <w:t>【常用標點】</w:t>
+      </w:r>
+    </w:p>
+    <w:p>
+      <w:pPr>
+        <w:spacing w:after="0" w:line="0" w:lineRule="atLeast"/>
+        <w:rPr>
+          <w:rFonts w:ascii="KlarMinTC GenKiMerriMix PunctFi" w:eastAsia="KlarMinTC GenKiMerriMix PunctFi" w:hAnsi="KlarMinTC GenKiMerriMix PunctFi"/>
+        </w:rPr>
+      </w:pPr>
+      <w:r>
+        <w:rPr>
+          <w:rFonts w:ascii="KlarMinTC GenKiMerriMix PunctFi" w:eastAsia="KlarMinTC GenKiMerriMix PunctFi" w:hAnsi="KlarMinTC GenKiMerriMix PunctFi" w:hint="eastAsia"/>
+        </w:rPr>
+        <w:t>「中文引號」、（全形括號）、，。！？；：…</w:t>
+      </w:r>
+      <w:proofErr w:type="gramStart"/>
+      <w:r>
+        <w:rPr>
+          <w:rFonts w:ascii="KlarMinTC GenKiMerriMix PunctFi" w:eastAsia="KlarMinTC GenKiMerriMix PunctFi" w:hAnsi="KlarMinTC GenKiMerriMix PunctFi" w:hint="eastAsia"/>
+        </w:rPr>
+        <w:t>…</w:t>
+      </w:r>
+      <w:proofErr w:type="gramEnd"/>
+      <w:r>
+        <w:rPr>
+          <w:rFonts w:ascii="KlarMinTC GenKiMerriMix PunctFi" w:eastAsia="KlarMinTC GenKiMerriMix PunctFi" w:hAnsi="KlarMinTC GenKiMerriMix PunctFi" w:hint="eastAsia"/>
+        </w:rPr>
+        <w:t>《書名號》〈篇名號〉</w:t>
+      </w:r>
+    </w:p>
+    <w:p>
+      <w:pPr>
+        <w:spacing w:after="0" w:line="0" w:lineRule="atLeast"/>
+        <w:rPr>
+          <w:rFonts w:ascii="KlarMinTC GenKiMerriMix PunctFi" w:eastAsia="KlarMinTC GenKiMerriMix PunctFi" w:hAnsi="KlarMinTC GenKiMerriMix PunctFi"/>
+        </w:rPr>
+      </w:pPr>
+      <w:r>
+        <w:rPr>
+          <w:rFonts w:ascii="KlarMinTC GenKiMerriMix PunctFi" w:eastAsia="KlarMinTC GenKiMerriMix PunctFi" w:hAnsi="KlarMinTC GenKiMerriMix PunctFi"/>
+        </w:rPr>
+        <w:t xml:space="preserve">"English quotes", (parentheses), [brackets], {braces}, / slash, - hyphen, – </w:t>
+      </w:r>
+      <w:proofErr w:type="spellStart"/>
+      <w:r>
+        <w:rPr>
+          <w:rFonts w:ascii="KlarMinTC GenKiMerriMix PunctFi" w:eastAsia="KlarMinTC GenKiMerriMix PunctFi" w:hAnsi="KlarMinTC GenKiMerriMix PunctFi"/>
+        </w:rPr>
+        <w:t>en</w:t>
+      </w:r>
+      <w:proofErr w:type="spellEnd"/>
+      <w:r>
+        <w:rPr>
+          <w:rFonts w:ascii="KlarMinTC GenKiMerriMix PunctFi" w:eastAsia="KlarMinTC GenKiMerriMix PunctFi" w:hAnsi="KlarMinTC GenKiMerriMix PunctFi"/>
+        </w:rPr>
+        <w:t xml:space="preserve"> dash, — </w:t>
+      </w:r>
+      <w:proofErr w:type="spellStart"/>
+      <w:r>
+        <w:rPr>
+          <w:rFonts w:ascii="KlarMinTC GenKiMerriMix PunctFi" w:eastAsia="KlarMinTC GenKiMerriMix PunctFi" w:hAnsi="KlarMinTC GenKiMerriMix PunctFi"/>
+        </w:rPr>
+        <w:t>em</w:t>
+      </w:r>
+      <w:proofErr w:type="spellEnd"/>
+      <w:r>
+        <w:rPr>
+          <w:rFonts w:ascii="KlarMinTC GenKiMerriMix PunctFi" w:eastAsia="KlarMinTC GenKiMerriMix PunctFi" w:hAnsi="KlarMinTC GenKiMerriMix PunctFi"/>
+        </w:rPr>
+        <w:t xml:space="preserve"> dash</w:t>
+      </w:r>
+    </w:p>
+    <w:p>
+      <w:pPr>
+        <w:spacing w:after="0" w:line="0" w:lineRule="atLeast"/>
+        <w:rPr>
+          <w:rFonts w:ascii="KlarMinTC GenKiMerriMix PunctFi" w:eastAsia="KlarMinTC GenKiMerriMix PunctFi" w:hAnsi="KlarMinTC GenKiMerriMix PunctFi"/>
+        </w:rPr>
+      </w:pPr>
+    </w:p>
+    <w:p>
+      <w:pPr>
+        <w:spacing w:after="0" w:line="0" w:lineRule="atLeast"/>
+        <w:rPr>
+          <w:rFonts w:ascii="KlarMinTC GenKiMerriMix PunctFi" w:eastAsia="KlarMinTC GenKiMerriMix PunctFi" w:hAnsi="KlarMinTC GenKiMerriMix PunctFi"/>
+        </w:rPr>
+      </w:pPr>
+      <w:r>
+        <w:rPr>
+          <w:rFonts w:ascii="KlarMinTC GenKiMerriMix PunctFi" w:eastAsia="KlarMinTC GenKiMerriMix PunctFi" w:hAnsi="KlarMinTC GenKiMerriMix PunctFi" w:hint="eastAsia"/>
+        </w:rPr>
+        <w:t>【高優先符號壓力測試】</w:t>
+      </w:r>
+    </w:p>
+    <w:p>
+      <w:pPr>
+        <w:spacing w:after="0" w:line="0" w:lineRule="atLeast"/>
+        <w:rPr>
+          <w:rFonts w:ascii="KlarMinTC GenKiMerriMix PunctFi" w:eastAsia="KlarMinTC GenKiMerriMix PunctFi" w:hAnsi="KlarMinTC GenKiMerriMix PunctFi"/>
+        </w:rPr>
+      </w:pPr>
+      <w:r>
+        <w:rPr>
+          <w:rFonts w:ascii="Times New Roman" w:eastAsia="KlarMinTC GenKiMerriMix PunctFi" w:hAnsi="Times New Roman" w:cs="Times New Roman"/>
+        </w:rPr>
+        <w:t>†</w:t>
+      </w:r>
+      <w:r>
+        <w:rPr>
+          <w:rFonts w:ascii="KlarMinTC GenKiMerriMix PunctFi" w:eastAsia="KlarMinTC GenKiMerriMix PunctFi" w:hAnsi="KlarMinTC GenKiMerriMix PunctFi"/>
+        </w:rPr>
+        <w:t xml:space="preserve"> </w:t>
+      </w:r>
+      <w:r>
+        <w:rPr>
+          <w:rFonts w:ascii="Times New Roman" w:eastAsia="KlarMinTC GenKiMerriMix PunctFi" w:hAnsi="Times New Roman" w:cs="Times New Roman"/>
+        </w:rPr>
+        <w:t>‡</w:t>
+      </w:r>
+      <w:r>
+        <w:rPr>
+          <w:rFonts w:ascii="KlarMinTC GenKiMerriMix PunctFi" w:eastAsia="KlarMinTC GenKiMerriMix PunctFi" w:hAnsi="KlarMinTC GenKiMerriMix PunctFi"/>
+        </w:rPr>
+        <w:t xml:space="preserve"> </w:t>
+      </w:r>
+      <w:r>
+        <w:rPr>
+          <w:rFonts w:ascii="Times New Roman" w:eastAsia="KlarMinTC GenKiMerriMix PunctFi" w:hAnsi="Times New Roman" w:cs="Times New Roman"/>
+        </w:rPr>
+        <w:t>‰</w:t>
+      </w:r>
+      <w:r>
+        <w:rPr>
+          <w:rFonts w:ascii="KlarMinTC GenKiMerriMix PunctFi" w:eastAsia="KlarMinTC GenKiMerriMix PunctFi" w:hAnsi="KlarMinTC GenKiMerriMix PunctFi"/>
+        </w:rPr>
+        <w:t xml:space="preserve"> </w:t>
+      </w:r>
+      <w:r>
+        <w:rPr>
+          <w:rFonts w:ascii="KlarMinTC GenKiMerriMix PunctFi" w:eastAsia="KlarMinTC GenKiMerriMix PunctFi" w:hAnsi="KlarMinTC GenKiMerriMix PunctFi" w:hint="eastAsia"/>
+        </w:rPr>
+        <w:t>℅</w:t>
+      </w:r>
+      <w:r>
+        <w:rPr>
+          <w:rFonts w:ascii="KlarMinTC GenKiMerriMix PunctFi" w:eastAsia="KlarMinTC GenKiMerriMix PunctFi" w:hAnsi="KlarMinTC GenKiMerriMix PunctFi"/>
+        </w:rPr>
+        <w:t xml:space="preserve"> </w:t>
+      </w:r>
+      <w:r>
+        <w:rPr>
+          <w:rFonts w:ascii="Cambria Math" w:eastAsia="KlarMinTC GenKiMerriMix PunctFi" w:hAnsi="Cambria Math" w:cs="Cambria Math"/>
+        </w:rPr>
+        <w:t>№</w:t>
+      </w:r>
+      <w:r>
+        <w:rPr>
+          <w:rFonts w:ascii="KlarMinTC GenKiMerriMix PunctFi" w:eastAsia="KlarMinTC GenKiMerriMix PunctFi" w:hAnsi="KlarMinTC GenKiMerriMix PunctFi"/>
+        </w:rPr>
+        <w:t xml:space="preserve"> </w:t>
+      </w:r>
+      <w:r>
+        <w:rPr>
+          <w:rFonts w:ascii="Cambria Math" w:eastAsia="KlarMinTC GenKiMerriMix PunctFi" w:hAnsi="Cambria Math" w:cs="Cambria Math"/>
+        </w:rPr>
+        <w:t>™</w:t>
+      </w:r>
+      <w:r>
+        <w:rPr>
+          <w:rFonts w:ascii="KlarMinTC GenKiMerriMix PunctFi" w:eastAsia="KlarMinTC GenKiMerriMix PunctFi" w:hAnsi="KlarMinTC GenKiMerriMix PunctFi"/>
+        </w:rPr>
+        <w:t xml:space="preserve"> </w:t>
+      </w:r>
+      <w:r>
+        <w:rPr>
+          <w:rFonts w:ascii="Cambria Math" w:eastAsia="KlarMinTC GenKiMerriMix PunctFi" w:hAnsi="Cambria Math" w:cs="Cambria Math"/>
+        </w:rPr>
+        <w:t>℮</w:t>
+      </w:r>
+      <w:r>
+        <w:rPr>
+          <w:rFonts w:ascii="KlarMinTC GenKiMerriMix PunctFi" w:eastAsia="KlarMinTC GenKiMerriMix PunctFi" w:hAnsi="KlarMinTC GenKiMerriMix PunctFi"/>
+        </w:rPr>
+        <w:t xml:space="preserve"> </w:t>
+      </w:r>
+      <w:r>
+        <w:rPr>
+          <w:rFonts w:ascii="Times New Roman" w:eastAsia="KlarMinTC GenKiMerriMix PunctFi" w:hAnsi="Times New Roman" w:cs="Times New Roman"/>
+        </w:rPr>
+        <w:t>◊</w:t>
+      </w:r>
+    </w:p>
+    <w:p>
+      <w:pPr>
+        <w:spacing w:after="0" w:line="0" w:lineRule="atLeast"/>
+        <w:rPr>
+          <w:rFonts w:ascii="KlarMinTC GenKiMerriMix PunctFi" w:eastAsia="KlarMinTC GenKiMerriMix PunctFi" w:hAnsi="KlarMinTC GenKiMerriMix PunctFi"/>
+        </w:rPr>
+      </w:pPr>
+      <w:r>
+        <w:rPr>
+          <w:rFonts w:ascii="KlarMinTC GenKiMerriMix PunctFi" w:eastAsia="KlarMinTC GenKiMerriMix PunctFi" w:hAnsi="KlarMinTC GenKiMerriMix PunctFi" w:hint="eastAsia"/>
+        </w:rPr>
+        <w:t>←</w:t>
+      </w:r>
+      <w:r>
+        <w:rPr>
+          <w:rFonts w:ascii="KlarMinTC GenKiMerriMix PunctFi" w:eastAsia="KlarMinTC GenKiMerriMix PunctFi" w:hAnsi="KlarMinTC GenKiMerriMix PunctFi"/>
+        </w:rPr>
+        <w:t xml:space="preserve"> </w:t>
+      </w:r>
+      <w:r>
+        <w:rPr>
+          <w:rFonts w:ascii="KlarMinTC GenKiMerriMix PunctFi" w:eastAsia="KlarMinTC GenKiMerriMix PunctFi" w:hAnsi="KlarMinTC GenKiMerriMix PunctFi" w:hint="eastAsia"/>
+        </w:rPr>
+        <w:t>↑</w:t>
+      </w:r>
+      <w:r>
+        <w:rPr>
+          <w:rFonts w:ascii="KlarMinTC GenKiMerriMix PunctFi" w:eastAsia="KlarMinTC GenKiMerriMix PunctFi" w:hAnsi="KlarMinTC GenKiMerriMix PunctFi"/>
+        </w:rPr>
+        <w:t xml:space="preserve"> </w:t>
+      </w:r>
+      <w:r>
+        <w:rPr>
+          <w:rFonts w:ascii="KlarMinTC GenKiMerriMix PunctFi" w:eastAsia="KlarMinTC GenKiMerriMix PunctFi" w:hAnsi="KlarMinTC GenKiMerriMix PunctFi" w:hint="eastAsia"/>
+        </w:rPr>
+        <w:t>→</w:t>
+      </w:r>
+      <w:r>
+        <w:rPr>
+          <w:rFonts w:ascii="KlarMinTC GenKiMerriMix PunctFi" w:eastAsia="KlarMinTC GenKiMerriMix PunctFi" w:hAnsi="KlarMinTC GenKiMerriMix PunctFi"/>
+        </w:rPr>
+        <w:t xml:space="preserve"> </w:t>
+      </w:r>
+      <w:r>
+        <w:rPr>
+          <w:rFonts w:ascii="KlarMinTC GenKiMerriMix PunctFi" w:eastAsia="KlarMinTC GenKiMerriMix PunctFi" w:hAnsi="KlarMinTC GenKiMerriMix PunctFi" w:hint="eastAsia"/>
+        </w:rPr>
+        <w:t>↓</w:t>
+      </w:r>
+      <w:r>
+        <w:rPr>
+          <w:rFonts w:ascii="KlarMinTC GenKiMerriMix PunctFi" w:eastAsia="KlarMinTC GenKiMerriMix PunctFi" w:hAnsi="KlarMinTC GenKiMerriMix PunctFi"/>
+        </w:rPr>
+        <w:t xml:space="preserve"> </w:t>
+      </w:r>
+      <w:r>
+        <w:rPr>
+          <w:rFonts w:ascii="Times New Roman" w:eastAsia="KlarMinTC GenKiMerriMix PunctFi" w:hAnsi="Times New Roman" w:cs="Times New Roman"/>
+        </w:rPr>
+        <w:t>↔</w:t>
+      </w:r>
+      <w:r>
+        <w:rPr>
+          <w:rFonts w:ascii="KlarMinTC GenKiMerriMix PunctFi" w:eastAsia="KlarMinTC GenKiMerriMix PunctFi" w:hAnsi="KlarMinTC GenKiMerriMix PunctFi"/>
+        </w:rPr>
+        <w:t xml:space="preserve"> </w:t>
+      </w:r>
+      <w:r>
+        <w:rPr>
+          <w:rFonts w:ascii="Times New Roman" w:eastAsia="KlarMinTC GenKiMerriMix PunctFi" w:hAnsi="Times New Roman" w:cs="Times New Roman"/>
+        </w:rPr>
+        <w:t>↕</w:t>
+      </w:r>
+    </w:p>
+    <w:p>
+      <w:pPr>
+        <w:spacing w:after="0" w:line="0" w:lineRule="atLeast"/>
+        <w:rPr>
+          <w:rFonts w:ascii="KlarMinTC GenKiMerriMix PunctFi" w:eastAsia="KlarMinTC GenKiMerriMix PunctFi" w:hAnsi="KlarMinTC GenKiMerriMix PunctFi"/>
+        </w:rPr>
+      </w:pPr>
+      <w:r>
+        <w:rPr>
+          <w:rFonts w:ascii="Cambria Math" w:eastAsia="KlarMinTC GenKiMerriMix PunctFi" w:hAnsi="Cambria Math" w:cs="Cambria Math"/>
+        </w:rPr>
+        <w:t>∂</w:t>
+      </w:r>
+      <w:r>
+        <w:rPr>
+          <w:rFonts w:ascii="KlarMinTC GenKiMerriMix PunctFi" w:eastAsia="KlarMinTC GenKiMerriMix PunctFi" w:hAnsi="KlarMinTC GenKiMerriMix PunctFi"/>
+        </w:rPr>
+        <w:t xml:space="preserve"> </w:t>
+      </w:r>
+      <w:r>
+        <w:rPr>
+          <w:rFonts w:ascii="Cambria Math" w:eastAsia="KlarMinTC GenKiMerriMix PunctFi" w:hAnsi="Cambria Math" w:cs="Cambria Math"/>
+        </w:rPr>
+        <w:t>∆</w:t>
+      </w:r>
+      <w:r>
+        <w:rPr>
+          <w:rFonts w:ascii="KlarMinTC GenKiMerriMix PunctFi" w:eastAsia="KlarMinTC GenKiMerriMix PunctFi" w:hAnsi="KlarMinTC GenKiMerriMix PunctFi"/>
+        </w:rPr>
+        <w:t xml:space="preserve"> </w:t>
+      </w:r>
+      <w:r>
+        <w:rPr>
+          <w:rFonts w:ascii="Cambria Math" w:eastAsia="KlarMinTC GenKiMerriMix PunctFi" w:hAnsi="Cambria Math" w:cs="Cambria Math"/>
+        </w:rPr>
+        <w:t>∏</w:t>
+      </w:r>
+      <w:r>
+        <w:rPr>
+          <w:rFonts w:ascii="KlarMinTC GenKiMerriMix PunctFi" w:eastAsia="KlarMinTC GenKiMerriMix PunctFi" w:hAnsi="KlarMinTC GenKiMerriMix PunctFi"/>
+        </w:rPr>
+        <w:t xml:space="preserve"> </w:t>
+      </w:r>
+      <w:r>
+        <w:rPr>
+          <w:rFonts w:ascii="Cambria Math" w:eastAsia="KlarMinTC GenKiMerriMix PunctFi" w:hAnsi="Cambria Math" w:cs="Cambria Math"/>
+        </w:rPr>
+        <w:t>∑</w:t>
+      </w:r>
+      <w:r>
+        <w:rPr>
+          <w:rFonts w:ascii="KlarMinTC GenKiMerriMix PunctFi" w:eastAsia="KlarMinTC GenKiMerriMix PunctFi" w:hAnsi="KlarMinTC GenKiMerriMix PunctFi"/>
+        </w:rPr>
+        <w:t xml:space="preserve"> </w:t>
+      </w:r>
+      <w:r>
+        <w:rPr>
+          <w:rFonts w:ascii="KlarMinTC GenKiMerriMix PunctFi" w:eastAsia="KlarMinTC GenKiMerriMix PunctFi" w:hAnsi="KlarMinTC GenKiMerriMix PunctFi" w:hint="eastAsia"/>
+        </w:rPr>
+        <w:t>∕</w:t>
+      </w:r>
+      <w:r>
+        <w:rPr>
+          <w:rFonts w:ascii="KlarMinTC GenKiMerriMix PunctFi" w:eastAsia="KlarMinTC GenKiMerriMix PunctFi" w:hAnsi="KlarMinTC GenKiMerriMix PunctFi"/>
+        </w:rPr>
+        <w:t xml:space="preserve"> </w:t>
+      </w:r>
+      <w:r>
+        <w:rPr>
+          <w:rFonts w:ascii="KlarMinTC GenKiMerriMix PunctFi" w:eastAsia="KlarMinTC GenKiMerriMix PunctFi" w:hAnsi="KlarMinTC GenKiMerriMix PunctFi" w:hint="eastAsia"/>
+        </w:rPr>
+        <w:t>√</w:t>
+      </w:r>
+      <w:r>
+        <w:rPr>
+          <w:rFonts w:ascii="KlarMinTC GenKiMerriMix PunctFi" w:eastAsia="KlarMinTC GenKiMerriMix PunctFi" w:hAnsi="KlarMinTC GenKiMerriMix PunctFi"/>
+        </w:rPr>
+        <w:t xml:space="preserve"> </w:t>
+      </w:r>
+      <w:r>
+        <w:rPr>
+          <w:rFonts w:ascii="KlarMinTC GenKiMerriMix PunctFi" w:eastAsia="KlarMinTC GenKiMerriMix PunctFi" w:hAnsi="KlarMinTC GenKiMerriMix PunctFi" w:hint="eastAsia"/>
+        </w:rPr>
+        <w:t>∞</w:t>
+      </w:r>
+      <w:r>
+        <w:rPr>
+          <w:rFonts w:ascii="KlarMinTC GenKiMerriMix PunctFi" w:eastAsia="KlarMinTC GenKiMerriMix PunctFi" w:hAnsi="KlarMinTC GenKiMerriMix PunctFi"/>
+        </w:rPr>
+        <w:t xml:space="preserve"> </w:t>
+      </w:r>
+      <w:r>
+        <w:rPr>
+          <w:rFonts w:ascii="KlarMinTC GenKiMerriMix PunctFi" w:eastAsia="KlarMinTC GenKiMerriMix PunctFi" w:hAnsi="KlarMinTC GenKiMerriMix PunctFi" w:hint="eastAsia"/>
+        </w:rPr>
+        <w:t>∫</w:t>
+      </w:r>
+      <w:r>
+        <w:rPr>
+          <w:rFonts w:ascii="KlarMinTC GenKiMerriMix PunctFi" w:eastAsia="KlarMinTC GenKiMerriMix PunctFi" w:hAnsi="KlarMinTC GenKiMerriMix PunctFi"/>
+        </w:rPr>
+        <w:t xml:space="preserve"> </w:t>
+      </w:r>
+      <w:r>
+        <w:rPr>
+          <w:rFonts w:ascii="Cambria Math" w:eastAsia="KlarMinTC GenKiMerriMix PunctFi" w:hAnsi="Cambria Math" w:cs="Cambria Math"/>
+        </w:rPr>
+        <w:t>≈</w:t>
+      </w:r>
+      <w:r>
+        <w:rPr>
+          <w:rFonts w:ascii="KlarMinTC GenKiMerriMix PunctFi" w:eastAsia="KlarMinTC GenKiMerriMix PunctFi" w:hAnsi="KlarMinTC GenKiMerriMix PunctFi"/>
+        </w:rPr>
+        <w:t xml:space="preserve"> </w:t>
+      </w:r>
+      <w:r>
+        <w:rPr>
+          <w:rFonts w:ascii="KlarMinTC GenKiMerriMix PunctFi" w:eastAsia="KlarMinTC GenKiMerriMix PunctFi" w:hAnsi="KlarMinTC GenKiMerriMix PunctFi" w:hint="eastAsia"/>
+        </w:rPr>
+        <w:t>≠</w:t>
+      </w:r>
+      <w:r>
+        <w:rPr>
+          <w:rFonts w:ascii="KlarMinTC GenKiMerriMix PunctFi" w:eastAsia="KlarMinTC GenKiMerriMix PunctFi" w:hAnsi="KlarMinTC GenKiMerriMix PunctFi"/>
+        </w:rPr>
+        <w:t xml:space="preserve"> </w:t>
+      </w:r>
+      <w:r>
+        <w:rPr>
+          <w:rFonts w:ascii="Cambria Math" w:eastAsia="KlarMinTC GenKiMerriMix PunctFi" w:hAnsi="Cambria Math" w:cs="Cambria Math"/>
+        </w:rPr>
+        <w:t>≤</w:t>
+      </w:r>
+      <w:r>
+        <w:rPr>
+          <w:rFonts w:ascii="KlarMinTC GenKiMerriMix PunctFi" w:eastAsia="KlarMinTC GenKiMerriMix PunctFi" w:hAnsi="KlarMinTC GenKiMerriMix PunctFi"/>
+        </w:rPr>
+        <w:t xml:space="preserve"> </w:t>
+      </w:r>
+      <w:r>
+        <w:rPr>
+          <w:rFonts w:ascii="Cambria Math" w:eastAsia="KlarMinTC GenKiMerriMix PunctFi" w:hAnsi="Cambria Math" w:cs="Cambria Math"/>
+        </w:rPr>
+        <w:t>≥</w:t>
+      </w:r>
+    </w:p>
+    <w:p>
+      <w:pPr>
+        <w:spacing w:after="0" w:line="0" w:lineRule="atLeast"/>
+        <w:rPr>
+          <w:rFonts w:ascii="KlarMinTC GenKiMerriMix PunctFi" w:eastAsia="KlarMinTC GenKiMerriMix PunctFi" w:hAnsi="KlarMinTC GenKiMerriMix PunctFi"/>
+        </w:rPr>
+      </w:pPr>
+    </w:p>
+    <w:p>
+      <w:pPr>
+        <w:spacing w:after="0" w:line="0" w:lineRule="atLeast"/>
+        <w:rPr>
+          <w:rFonts w:ascii="KlarMinTC GenKiMerriMix PunctFi" w:eastAsia="KlarMinTC GenKiMerriMix PunctFi" w:hAnsi="KlarMinTC GenKiMerriMix PunctFi"/>
+        </w:rPr>
+      </w:pPr>
+      <w:r>
+        <w:rPr>
+          <w:rFonts w:ascii="KlarMinTC GenKiMerriMix PunctFi" w:eastAsia="KlarMinTC GenKiMerriMix PunctFi" w:hAnsi="KlarMinTC GenKiMerriMix PunctFi" w:hint="eastAsia"/>
+        </w:rPr>
+        <w:lastRenderedPageBreak/>
+        <w:t>【混排壓力句】</w:t>
+      </w:r>
+    </w:p>
+    <w:p>
+      <w:pPr>
+        <w:spacing w:after="0" w:line="0" w:lineRule="atLeast"/>
+        <w:rPr>
+          <w:rFonts w:ascii="KlarMinTC GenKiMerriMix PunctFi" w:eastAsia="KlarMinTC GenKiMerriMix PunctFi" w:hAnsi="KlarMinTC GenKiMerriMix PunctFi"/>
+        </w:rPr>
+      </w:pPr>
+      <w:r>
+        <w:rPr>
+          <w:rFonts w:ascii="KlarMinTC GenKiMerriMix PunctFi" w:eastAsia="KlarMinTC GenKiMerriMix PunctFi" w:hAnsi="KlarMinTC GenKiMerriMix PunctFi" w:hint="eastAsia"/>
+        </w:rPr>
+        <w:t>請見圖</w:t>
+      </w:r>
+      <w:r>
+        <w:rPr>
+          <w:rFonts w:ascii="KlarMinTC GenKiMerriMix PunctFi" w:eastAsia="KlarMinTC GenKiMerriMix PunctFi" w:hAnsi="KlarMinTC GenKiMerriMix PunctFi"/>
+        </w:rPr>
+        <w:t xml:space="preserve"> 3 </w:t>
+      </w:r>
+      <w:r>
+        <w:rPr>
+          <w:rFonts w:ascii="KlarMinTC GenKiMerriMix PunctFi" w:eastAsia="KlarMinTC GenKiMerriMix PunctFi" w:hAnsi="KlarMinTC GenKiMerriMix PunctFi" w:hint="eastAsia"/>
+        </w:rPr>
+        <w:t>→</w:t>
+      </w:r>
+      <w:r>
+        <w:rPr>
+          <w:rFonts w:ascii="KlarMinTC GenKiMerriMix PunctFi" w:eastAsia="KlarMinTC GenKiMerriMix PunctFi" w:hAnsi="KlarMinTC GenKiMerriMix PunctFi"/>
+        </w:rPr>
+        <w:t xml:space="preserve"> </w:t>
+      </w:r>
+      <w:r>
+        <w:rPr>
+          <w:rFonts w:ascii="KlarMinTC GenKiMerriMix PunctFi" w:eastAsia="KlarMinTC GenKiMerriMix PunctFi" w:hAnsi="KlarMinTC GenKiMerriMix PunctFi" w:hint="eastAsia"/>
+        </w:rPr>
+        <w:t>表</w:t>
+      </w:r>
+      <w:r>
+        <w:rPr>
+          <w:rFonts w:ascii="KlarMinTC GenKiMerriMix PunctFi" w:eastAsia="KlarMinTC GenKiMerriMix PunctFi" w:hAnsi="KlarMinTC GenKiMerriMix PunctFi"/>
+        </w:rPr>
+        <w:t xml:space="preserve"> 4</w:t>
+      </w:r>
+      <w:r>
+        <w:rPr>
+          <w:rFonts w:ascii="KlarMinTC GenKiMerriMix PunctFi" w:eastAsia="KlarMinTC GenKiMerriMix PunctFi" w:hAnsi="KlarMinTC GenKiMerriMix PunctFi" w:hint="eastAsia"/>
+        </w:rPr>
+        <w:t>，誤差約為</w:t>
+      </w:r>
+      <w:r>
+        <w:rPr>
+          <w:rFonts w:ascii="KlarMinTC GenKiMerriMix PunctFi" w:eastAsia="KlarMinTC GenKiMerriMix PunctFi" w:hAnsi="KlarMinTC GenKiMerriMix PunctFi"/>
+        </w:rPr>
+        <w:t xml:space="preserve"> </w:t>
+      </w:r>
+      <w:r>
+        <w:rPr>
+          <w:rFonts w:ascii="KlarMinTC GenKiMerriMix PunctFi" w:eastAsia="KlarMinTC GenKiMerriMix PunctFi" w:hAnsi="KlarMinTC GenKiMerriMix PunctFi" w:hint="eastAsia"/>
+        </w:rPr>
+        <w:t>∫</w:t>
+      </w:r>
+      <w:r>
+        <w:rPr>
+          <w:rFonts w:ascii="KlarMinTC GenKiMerriMix PunctFi" w:eastAsia="KlarMinTC GenKiMerriMix PunctFi" w:hAnsi="KlarMinTC GenKiMerriMix PunctFi"/>
+        </w:rPr>
+        <w:t xml:space="preserve">_0^1 x^2 dx </w:t>
+      </w:r>
+      <w:r>
+        <w:rPr>
+          <w:rFonts w:ascii="Cambria Math" w:eastAsia="KlarMinTC GenKiMerriMix PunctFi" w:hAnsi="Cambria Math" w:cs="Cambria Math"/>
+        </w:rPr>
+        <w:t>≈</w:t>
+      </w:r>
+      <w:r>
+        <w:rPr>
+          <w:rFonts w:ascii="KlarMinTC GenKiMerriMix PunctFi" w:eastAsia="KlarMinTC GenKiMerriMix PunctFi" w:hAnsi="KlarMinTC GenKiMerriMix PunctFi"/>
+        </w:rPr>
+        <w:t xml:space="preserve"> 0.333</w:t>
+      </w:r>
+      <w:r>
+        <w:rPr>
+          <w:rFonts w:ascii="KlarMinTC GenKiMerriMix PunctFi" w:eastAsia="KlarMinTC GenKiMerriMix PunctFi" w:hAnsi="KlarMinTC GenKiMerriMix PunctFi" w:hint="eastAsia"/>
+        </w:rPr>
+        <w:t>；若條件</w:t>
+      </w:r>
+      <w:r>
+        <w:rPr>
+          <w:rFonts w:ascii="KlarMinTC GenKiMerriMix PunctFi" w:eastAsia="KlarMinTC GenKiMerriMix PunctFi" w:hAnsi="KlarMinTC GenKiMerriMix PunctFi"/>
+        </w:rPr>
+        <w:t xml:space="preserve"> A </w:t>
+      </w:r>
+      <w:r>
+        <w:rPr>
+          <w:rFonts w:ascii="KlarMinTC GenKiMerriMix PunctFi" w:eastAsia="KlarMinTC GenKiMerriMix PunctFi" w:hAnsi="KlarMinTC GenKiMerriMix PunctFi" w:hint="eastAsia"/>
+        </w:rPr>
+        <w:t>≠</w:t>
+      </w:r>
+      <w:r>
+        <w:rPr>
+          <w:rFonts w:ascii="KlarMinTC GenKiMerriMix PunctFi" w:eastAsia="KlarMinTC GenKiMerriMix PunctFi" w:hAnsi="KlarMinTC GenKiMerriMix PunctFi"/>
+        </w:rPr>
+        <w:t xml:space="preserve"> B</w:t>
+      </w:r>
+      <w:r>
+        <w:rPr>
+          <w:rFonts w:ascii="KlarMinTC GenKiMerriMix PunctFi" w:eastAsia="KlarMinTC GenKiMerriMix PunctFi" w:hAnsi="KlarMinTC GenKiMerriMix PunctFi" w:hint="eastAsia"/>
+        </w:rPr>
+        <w:t>，則以</w:t>
+      </w:r>
+      <w:r>
+        <w:rPr>
+          <w:rFonts w:ascii="KlarMinTC GenKiMerriMix PunctFi" w:eastAsia="KlarMinTC GenKiMerriMix PunctFi" w:hAnsi="KlarMinTC GenKiMerriMix PunctFi"/>
+        </w:rPr>
+        <w:t xml:space="preserve"> </w:t>
+      </w:r>
+      <w:r>
+        <w:rPr>
+          <w:rFonts w:ascii="Cambria Math" w:eastAsia="KlarMinTC GenKiMerriMix PunctFi" w:hAnsi="Cambria Math" w:cs="Cambria Math"/>
+        </w:rPr>
+        <w:t>∑</w:t>
+      </w:r>
+      <w:r>
+        <w:rPr>
+          <w:rFonts w:ascii="KlarMinTC GenKiMerriMix PunctFi" w:eastAsia="KlarMinTC GenKiMerriMix PunctFi" w:hAnsi="KlarMinTC GenKiMerriMix PunctFi" w:hint="eastAsia"/>
+        </w:rPr>
+        <w:t>、</w:t>
+      </w:r>
+      <w:r>
+        <w:rPr>
+          <w:rFonts w:ascii="Cambria Math" w:eastAsia="KlarMinTC GenKiMerriMix PunctFi" w:hAnsi="Cambria Math" w:cs="Cambria Math"/>
+        </w:rPr>
+        <w:t>∏</w:t>
+      </w:r>
+      <w:r>
+        <w:rPr>
+          <w:rFonts w:ascii="KlarMinTC GenKiMerriMix PunctFi" w:eastAsia="KlarMinTC GenKiMerriMix PunctFi" w:hAnsi="KlarMinTC GenKiMerriMix PunctFi"/>
+        </w:rPr>
+        <w:t xml:space="preserve"> </w:t>
+      </w:r>
+      <w:r>
+        <w:rPr>
+          <w:rFonts w:ascii="KlarMinTC GenKiMerriMix PunctFi" w:eastAsia="KlarMinTC GenKiMerriMix PunctFi" w:hAnsi="KlarMinTC GenKiMerriMix PunctFi" w:hint="eastAsia"/>
+        </w:rPr>
+        <w:t>與</w:t>
+      </w:r>
+      <w:r>
+        <w:rPr>
+          <w:rFonts w:ascii="KlarMinTC GenKiMerriMix PunctFi" w:eastAsia="KlarMinTC GenKiMerriMix PunctFi" w:hAnsi="KlarMinTC GenKiMerriMix PunctFi"/>
+        </w:rPr>
+        <w:t xml:space="preserve"> </w:t>
+      </w:r>
+      <w:r>
+        <w:rPr>
+          <w:rFonts w:ascii="KlarMinTC GenKiMerriMix PunctFi" w:eastAsia="KlarMinTC GenKiMerriMix PunctFi" w:hAnsi="KlarMinTC GenKiMerriMix PunctFi" w:hint="eastAsia"/>
+        </w:rPr>
+        <w:t>√</w:t>
+      </w:r>
+      <w:r>
+        <w:rPr>
+          <w:rFonts w:ascii="KlarMinTC GenKiMerriMix PunctFi" w:eastAsia="KlarMinTC GenKiMerriMix PunctFi" w:hAnsi="KlarMinTC GenKiMerriMix PunctFi"/>
+        </w:rPr>
+        <w:t xml:space="preserve"> </w:t>
+      </w:r>
+      <w:r>
+        <w:rPr>
+          <w:rFonts w:ascii="KlarMinTC GenKiMerriMix PunctFi" w:eastAsia="KlarMinTC GenKiMerriMix PunctFi" w:hAnsi="KlarMinTC GenKiMerriMix PunctFi" w:hint="eastAsia"/>
+        </w:rPr>
+        <w:t>重新整理推導，並在註記中加入</w:t>
+      </w:r>
+      <w:r>
+        <w:rPr>
+          <w:rFonts w:ascii="KlarMinTC GenKiMerriMix PunctFi" w:eastAsia="KlarMinTC GenKiMerriMix PunctFi" w:hAnsi="KlarMinTC GenKiMerriMix PunctFi"/>
+        </w:rPr>
+        <w:t xml:space="preserve"> </w:t>
+      </w:r>
+      <w:r>
+        <w:rPr>
+          <w:rFonts w:ascii="Cambria Math" w:eastAsia="KlarMinTC GenKiMerriMix PunctFi" w:hAnsi="Cambria Math" w:cs="Cambria Math"/>
+        </w:rPr>
+        <w:t>™</w:t>
+      </w:r>
+      <w:r>
+        <w:rPr>
+          <w:rFonts w:ascii="KlarMinTC GenKiMerriMix PunctFi" w:eastAsia="KlarMinTC GenKiMerriMix PunctFi" w:hAnsi="KlarMinTC GenKiMerriMix PunctFi" w:hint="eastAsia"/>
+        </w:rPr>
+        <w:t>、</w:t>
+      </w:r>
+      <w:r>
+        <w:rPr>
+          <w:rFonts w:ascii="Cambria Math" w:eastAsia="KlarMinTC GenKiMerriMix PunctFi" w:hAnsi="Cambria Math" w:cs="Cambria Math"/>
+        </w:rPr>
+        <w:t>№</w:t>
+      </w:r>
+      <w:r>
+        <w:rPr>
+          <w:rFonts w:ascii="KlarMinTC GenKiMerriMix PunctFi" w:eastAsia="KlarMinTC GenKiMerriMix PunctFi" w:hAnsi="KlarMinTC GenKiMerriMix PunctFi" w:hint="eastAsia"/>
+        </w:rPr>
+        <w:t>、</w:t>
+      </w:r>
+      <w:r>
+        <w:rPr>
+          <w:rFonts w:ascii="Times New Roman" w:eastAsia="KlarMinTC GenKiMerriMix PunctFi" w:hAnsi="Times New Roman" w:cs="Times New Roman"/>
+        </w:rPr>
+        <w:t>‰</w:t>
+      </w:r>
+      <w:r>
+        <w:rPr>
+          <w:rFonts w:ascii="KlarMinTC GenKiMerriMix PunctFi" w:eastAsia="KlarMinTC GenKiMerriMix PunctFi" w:hAnsi="KlarMinTC GenKiMerriMix PunctFi"/>
+        </w:rPr>
+        <w:t xml:space="preserve"> </w:t>
+      </w:r>
+      <w:r>
+        <w:rPr>
+          <w:rFonts w:ascii="KlarMinTC GenKiMerriMix PunctFi" w:eastAsia="KlarMinTC GenKiMerriMix PunctFi" w:hAnsi="KlarMinTC GenKiMerriMix PunctFi" w:hint="eastAsia"/>
+        </w:rPr>
+        <w:t>與</w:t>
+      </w:r>
+      <w:r>
+        <w:rPr>
+          <w:rFonts w:ascii="KlarMinTC GenKiMerriMix PunctFi" w:eastAsia="KlarMinTC GenKiMerriMix PunctFi" w:hAnsi="KlarMinTC GenKiMerriMix PunctFi"/>
+        </w:rPr>
+        <w:t xml:space="preserve"> </w:t>
+      </w:r>
+      <w:r>
+        <w:rPr>
+          <w:rFonts w:ascii="KlarMinTC GenKiMerriMix PunctFi" w:eastAsia="KlarMinTC GenKiMerriMix PunctFi" w:hAnsi="KlarMinTC GenKiMerriMix PunctFi" w:hint="eastAsia"/>
+        </w:rPr>
+        <w:t>℅。</w:t>
+      </w:r>
+    </w:p>
+    <w:p>
+      <w:pPr>
+        <w:spacing w:after="0" w:line="0" w:lineRule="atLeast"/>
+        <w:rPr>
+          <w:rFonts w:ascii="KlarMinTC GenKiMerriMix PunctFi" w:eastAsia="KlarMinTC GenKiMerriMix PunctFi" w:hAnsi="KlarMinTC GenKiMerriMix PunctFi"/>
+        </w:rPr>
+      </w:pPr>
+    </w:p>
+    <w:p>
+      <w:pPr>
+        <w:spacing w:after="0" w:line="0" w:lineRule="atLeast"/>
+        <w:rPr>
+          <w:rFonts w:ascii="KlarMinTC GenKiMerriMix PunctFi" w:eastAsia="KlarMinTC GenKiMerriMix PunctFi" w:hAnsi="KlarMinTC GenKiMerriMix PunctFi"/>
+        </w:rPr>
+      </w:pPr>
+      <w:r>
+        <w:rPr>
+          <w:rFonts w:ascii="KlarMinTC GenKiMerriMix PunctFi" w:eastAsia="KlarMinTC GenKiMerriMix PunctFi" w:hAnsi="KlarMinTC GenKiMerriMix PunctFi" w:hint="eastAsia"/>
+        </w:rPr>
+        <w:t>【擴充拉丁】</w:t>
+      </w:r>
+    </w:p>
+    <w:p>
+      <w:pPr>
+        <w:spacing w:after="0" w:line="0" w:lineRule="atLeast"/>
+        <w:rPr>
+          <w:rFonts w:ascii="KlarMinTC GenKiMerriMix PunctFi" w:eastAsia="KlarMinTC GenKiMerriMix PunctFi" w:hAnsi="KlarMinTC GenKiMerriMix PunctFi"/>
+        </w:rPr>
+      </w:pPr>
+      <w:r>
+        <w:rPr>
+          <w:rFonts w:ascii="Cambria" w:eastAsia="KlarMinTC GenKiMerriMix PunctFi" w:hAnsi="Cambria" w:cs="Cambria"/>
+        </w:rPr>
+        <w:t>Ů</w:t>
+      </w:r>
+      <w:r>
+        <w:rPr>
+          <w:rFonts w:ascii="KlarMinTC GenKiMerriMix PunctFi" w:eastAsia="KlarMinTC GenKiMerriMix PunctFi" w:hAnsi="KlarMinTC GenKiMerriMix PunctFi"/>
+        </w:rPr>
+        <w:t xml:space="preserve"> </w:t>
+      </w:r>
+      <w:r>
+        <w:rPr>
+          <w:rFonts w:ascii="Cambria" w:eastAsia="KlarMinTC GenKiMerriMix PunctFi" w:hAnsi="Cambria" w:cs="Cambria"/>
+        </w:rPr>
+        <w:t>Ǖ</w:t>
+      </w:r>
+      <w:r>
+        <w:rPr>
+          <w:rFonts w:ascii="KlarMinTC GenKiMerriMix PunctFi" w:eastAsia="KlarMinTC GenKiMerriMix PunctFi" w:hAnsi="KlarMinTC GenKiMerriMix PunctFi"/>
+        </w:rPr>
+        <w:t xml:space="preserve"> </w:t>
+      </w:r>
+      <w:r>
+        <w:rPr>
+          <w:rFonts w:ascii="Cambria" w:eastAsia="KlarMinTC GenKiMerriMix PunctFi" w:hAnsi="Cambria" w:cs="Cambria"/>
+        </w:rPr>
+        <w:t>Ǘ</w:t>
+      </w:r>
+      <w:r>
+        <w:rPr>
+          <w:rFonts w:ascii="KlarMinTC GenKiMerriMix PunctFi" w:eastAsia="KlarMinTC GenKiMerriMix PunctFi" w:hAnsi="KlarMinTC GenKiMerriMix PunctFi"/>
+        </w:rPr>
+        <w:t xml:space="preserve"> </w:t>
+      </w:r>
+      <w:r>
+        <w:rPr>
+          <w:rFonts w:ascii="Cambria" w:eastAsia="KlarMinTC GenKiMerriMix PunctFi" w:hAnsi="Cambria" w:cs="Cambria"/>
+        </w:rPr>
+        <w:t>Ǚ</w:t>
+      </w:r>
+      <w:r>
+        <w:rPr>
+          <w:rFonts w:ascii="KlarMinTC GenKiMerriMix PunctFi" w:eastAsia="KlarMinTC GenKiMerriMix PunctFi" w:hAnsi="KlarMinTC GenKiMerriMix PunctFi"/>
+        </w:rPr>
+        <w:t xml:space="preserve"> </w:t>
+      </w:r>
+      <w:r>
+        <w:rPr>
+          <w:rFonts w:ascii="Cambria" w:eastAsia="KlarMinTC GenKiMerriMix PunctFi" w:hAnsi="Cambria" w:cs="Cambria"/>
+        </w:rPr>
+        <w:t>Ǜ</w:t>
+      </w:r>
+    </w:p>
+    <w:p>
+      <w:pPr>
+        <w:spacing w:after="0" w:line="0" w:lineRule="atLeast"/>
+        <w:rPr>
+          <w:rFonts w:ascii="KlarMinTC GenKiMerriMix PunctFi" w:eastAsia="KlarMinTC GenKiMerriMix PunctFi" w:hAnsi="KlarMinTC GenKiMerriMix PunctFi"/>
+        </w:rPr>
+      </w:pPr>
+      <w:r>
+        <w:rPr>
+          <w:rFonts w:ascii="Cambria" w:eastAsia="KlarMinTC GenKiMerriMix PunctFi" w:hAnsi="Cambria" w:cs="Cambria"/>
+        </w:rPr>
+        <w:t>Ẩ</w:t>
+      </w:r>
+      <w:r>
+        <w:rPr>
+          <w:rFonts w:ascii="KlarMinTC GenKiMerriMix PunctFi" w:eastAsia="KlarMinTC GenKiMerriMix PunctFi" w:hAnsi="KlarMinTC GenKiMerriMix PunctFi"/>
+        </w:rPr>
+        <w:t xml:space="preserve"> </w:t>
+      </w:r>
+      <w:r>
+        <w:rPr>
+          <w:rFonts w:ascii="Cambria" w:eastAsia="KlarMinTC GenKiMerriMix PunctFi" w:hAnsi="Cambria" w:cs="Cambria"/>
+        </w:rPr>
+        <w:t>Ẫ</w:t>
+      </w:r>
+      <w:r>
+        <w:rPr>
+          <w:rFonts w:ascii="KlarMinTC GenKiMerriMix PunctFi" w:eastAsia="KlarMinTC GenKiMerriMix PunctFi" w:hAnsi="KlarMinTC GenKiMerriMix PunctFi"/>
+        </w:rPr>
+        <w:t xml:space="preserve"> </w:t>
+      </w:r>
+      <w:r>
+        <w:rPr>
+          <w:rFonts w:ascii="Cambria" w:eastAsia="KlarMinTC GenKiMerriMix PunctFi" w:hAnsi="Cambria" w:cs="Cambria"/>
+        </w:rPr>
+        <w:t>Ắ</w:t>
+      </w:r>
+      <w:r>
+        <w:rPr>
+          <w:rFonts w:ascii="KlarMinTC GenKiMerriMix PunctFi" w:eastAsia="KlarMinTC GenKiMerriMix PunctFi" w:hAnsi="KlarMinTC GenKiMerriMix PunctFi"/>
+        </w:rPr>
+        <w:t xml:space="preserve"> </w:t>
+      </w:r>
+      <w:r>
+        <w:rPr>
+          <w:rFonts w:ascii="Cambria" w:eastAsia="KlarMinTC GenKiMerriMix PunctFi" w:hAnsi="Cambria" w:cs="Cambria"/>
+        </w:rPr>
+        <w:t>Ằ</w:t>
+      </w:r>
+      <w:r>
+        <w:rPr>
+          <w:rFonts w:ascii="KlarMinTC GenKiMerriMix PunctFi" w:eastAsia="KlarMinTC GenKiMerriMix PunctFi" w:hAnsi="KlarMinTC GenKiMerriMix PunctFi"/>
+        </w:rPr>
+        <w:t xml:space="preserve"> </w:t>
+      </w:r>
+      <w:r>
+        <w:rPr>
+          <w:rFonts w:ascii="Cambria" w:eastAsia="KlarMinTC GenKiMerriMix PunctFi" w:hAnsi="Cambria" w:cs="Cambria"/>
+        </w:rPr>
+        <w:t>Ẳ</w:t>
+      </w:r>
+      <w:r>
+        <w:rPr>
+          <w:rFonts w:ascii="KlarMinTC GenKiMerriMix PunctFi" w:eastAsia="KlarMinTC GenKiMerriMix PunctFi" w:hAnsi="KlarMinTC GenKiMerriMix PunctFi"/>
+        </w:rPr>
+        <w:t xml:space="preserve"> </w:t>
+      </w:r>
+      <w:r>
+        <w:rPr>
+          <w:rFonts w:ascii="Cambria" w:eastAsia="KlarMinTC GenKiMerriMix PunctFi" w:hAnsi="Cambria" w:cs="Cambria"/>
+        </w:rPr>
+        <w:t>Ẵ</w:t>
+      </w:r>
+    </w:p>
+    <w:p>
+      <w:pPr>
+        <w:spacing w:after="0" w:line="0" w:lineRule="atLeast"/>
+        <w:rPr>
+          <w:rFonts w:ascii="KlarMinTC GenKiMerriMix PunctFi" w:eastAsia="KlarMinTC GenKiMerriMix PunctFi" w:hAnsi="KlarMinTC GenKiMerriMix PunctFi"/>
+        </w:rPr>
+      </w:pPr>
+      <w:r>
+        <w:rPr>
+          <w:rFonts w:ascii="Cambria" w:eastAsia="KlarMinTC GenKiMerriMix PunctFi" w:hAnsi="Cambria" w:cs="Cambria"/>
+        </w:rPr>
+        <w:t>Ể</w:t>
+      </w:r>
+      <w:r>
+        <w:rPr>
+          <w:rFonts w:ascii="KlarMinTC GenKiMerriMix PunctFi" w:eastAsia="KlarMinTC GenKiMerriMix PunctFi" w:hAnsi="KlarMinTC GenKiMerriMix PunctFi"/>
+        </w:rPr>
+        <w:t xml:space="preserve"> </w:t>
+      </w:r>
+      <w:r>
+        <w:rPr>
+          <w:rFonts w:ascii="Cambria" w:eastAsia="KlarMinTC GenKiMerriMix PunctFi" w:hAnsi="Cambria" w:cs="Cambria"/>
+        </w:rPr>
+        <w:t>Ễ</w:t>
+      </w:r>
+      <w:r>
+        <w:rPr>
+          <w:rFonts w:ascii="KlarMinTC GenKiMerriMix PunctFi" w:eastAsia="KlarMinTC GenKiMerriMix PunctFi" w:hAnsi="KlarMinTC GenKiMerriMix PunctFi"/>
+        </w:rPr>
+        <w:t xml:space="preserve"> </w:t>
+      </w:r>
+      <w:r>
+        <w:rPr>
+          <w:rFonts w:ascii="Cambria" w:eastAsia="KlarMinTC GenKiMerriMix PunctFi" w:hAnsi="Cambria" w:cs="Cambria"/>
+        </w:rPr>
+        <w:t>Ổ</w:t>
+      </w:r>
+      <w:r>
+        <w:rPr>
+          <w:rFonts w:ascii="KlarMinTC GenKiMerriMix PunctFi" w:eastAsia="KlarMinTC GenKiMerriMix PunctFi" w:hAnsi="KlarMinTC GenKiMerriMix PunctFi"/>
+        </w:rPr>
+        <w:t xml:space="preserve"> </w:t>
+      </w:r>
+      <w:r>
+        <w:rPr>
+          <w:rFonts w:ascii="Cambria" w:eastAsia="KlarMinTC GenKiMerriMix PunctFi" w:hAnsi="Cambria" w:cs="Cambria"/>
+        </w:rPr>
+        <w:t>Ỗ</w:t>
+      </w:r>
+    </w:p>
+    <w:p>
+      <w:pPr>
+        <w:spacing w:after="0" w:line="0" w:lineRule="atLeast"/>
+        <w:rPr>
+          <w:rFonts w:ascii="KlarMinTC GenKiMerriMix PunctFi" w:eastAsia="KlarMinTC GenKiMerriMix PunctFi" w:hAnsi="KlarMinTC GenKiMerriMix PunctFi"/>
+        </w:rPr>
+      </w:pPr>
+    </w:p>
+    <w:p>
+      <w:pPr>
+        <w:spacing w:after="0" w:line="0" w:lineRule="atLeast"/>
+        <w:rPr>
+          <w:rFonts w:ascii="KlarMinTC GenKiMerriMix PunctFi" w:eastAsia="KlarMinTC GenKiMerriMix PunctFi" w:hAnsi="KlarMinTC GenKiMerriMix PunctFi"/>
+        </w:rPr>
+      </w:pPr>
+      <w:r>
+        <w:rPr>
+          <w:rFonts w:ascii="KlarMinTC GenKiMerriMix PunctFi" w:eastAsia="KlarMinTC GenKiMerriMix PunctFi" w:hAnsi="KlarMinTC GenKiMerriMix PunctFi" w:hint="eastAsia"/>
+        </w:rPr>
+        <w:t>【注音 / 聲調】</w:t>
+      </w:r>
+    </w:p>
+    <w:p>
+      <w:pPr>
+        <w:spacing w:after="0" w:line="0" w:lineRule="atLeast"/>
+        <w:rPr>
+          <w:rFonts w:ascii="KlarMinTC GenKiMerriMix PunctFi" w:eastAsia="KlarMinTC GenKiMerriMix PunctFi" w:hAnsi="KlarMinTC GenKiMerriMix PunctFi"/>
+        </w:rPr>
+      </w:pPr>
+      <w:proofErr w:type="gramStart"/>
+      <w:r>
+        <w:rPr>
+          <w:rFonts w:ascii="KlarMinTC GenKiMerriMix PunctFi" w:eastAsia="KlarMinTC GenKiMerriMix PunctFi" w:hAnsi="KlarMinTC GenKiMerriMix PunctFi" w:hint="eastAsia"/>
+        </w:rPr>
+        <w:t>ㄅㄆㄇㄈ</w:t>
+      </w:r>
+      <w:proofErr w:type="gramEnd"/>
+      <w:r>
+        <w:rPr>
+          <w:rFonts w:ascii="KlarMinTC GenKiMerriMix PunctFi" w:eastAsia="KlarMinTC GenKiMerriMix PunctFi" w:hAnsi="KlarMinTC GenKiMerriMix PunctFi" w:hint="eastAsia"/>
+        </w:rPr>
+        <w:t xml:space="preserve"> </w:t>
+      </w:r>
+      <w:proofErr w:type="gramStart"/>
+      <w:r>
+        <w:rPr>
+          <w:rFonts w:ascii="KlarMinTC GenKiMerriMix PunctFi" w:eastAsia="KlarMinTC GenKiMerriMix PunctFi" w:hAnsi="KlarMinTC GenKiMerriMix PunctFi" w:hint="eastAsia"/>
+        </w:rPr>
+        <w:t>ㄉㄊㄋㄌ</w:t>
+      </w:r>
+      <w:proofErr w:type="gramEnd"/>
+      <w:r>
+        <w:rPr>
+          <w:rFonts w:ascii="KlarMinTC GenKiMerriMix PunctFi" w:eastAsia="KlarMinTC GenKiMerriMix PunctFi" w:hAnsi="KlarMinTC GenKiMerriMix PunctFi" w:hint="eastAsia"/>
+        </w:rPr>
+        <w:t xml:space="preserve"> </w:t>
+      </w:r>
+      <w:proofErr w:type="gramStart"/>
+      <w:r>
+        <w:rPr>
+          <w:rFonts w:ascii="KlarMinTC GenKiMerriMix PunctFi" w:eastAsia="KlarMinTC GenKiMerriMix PunctFi" w:hAnsi="KlarMinTC GenKiMerriMix PunctFi" w:hint="eastAsia"/>
+        </w:rPr>
+        <w:t>ㄍㄎㄏ</w:t>
+      </w:r>
+      <w:proofErr w:type="gramEnd"/>
+    </w:p>
+    <w:p>
+      <w:pPr>
+        <w:spacing w:after="0" w:line="0" w:lineRule="atLeast"/>
+        <w:rPr>
+          <w:rFonts w:ascii="KlarMinTC GenKiMerriMix PunctFi" w:eastAsia="KlarMinTC GenKiMerriMix PunctFi" w:hAnsi="KlarMinTC GenKiMerriMix PunctFi"/>
+        </w:rPr>
+      </w:pPr>
+      <w:r>
+        <w:rPr>
+          <w:rFonts w:ascii="Noto Sans TC" w:eastAsia="Noto Sans TC" w:hAnsi="Noto Sans TC" w:cs="Noto Sans TC" w:hint="eastAsia"/>
+        </w:rPr>
+        <w:t>〪</w:t>
+      </w:r>
+      <w:r>
+        <w:rPr>
+          <w:rFonts w:ascii="KlarMinTC GenKiMerriMix PunctFi" w:eastAsia="KlarMinTC GenKiMerriMix PunctFi" w:hAnsi="KlarMinTC GenKiMerriMix PunctFi"/>
+        </w:rPr>
+        <w:t xml:space="preserve"> </w:t>
+      </w:r>
+      <w:r>
+        <w:rPr>
+          <w:rFonts w:ascii="Noto Sans TC" w:eastAsia="Noto Sans TC" w:hAnsi="Noto Sans TC" w:cs="Noto Sans TC" w:hint="eastAsia"/>
+        </w:rPr>
+        <w:t>〫</w:t>
+      </w:r>
+      <w:r>
+        <w:rPr>
+          <w:rFonts w:ascii="KlarMinTC GenKiMerriMix PunctFi" w:eastAsia="KlarMinTC GenKiMerriMix PunctFi" w:hAnsi="KlarMinTC GenKiMerriMix PunctFi"/>
+        </w:rPr>
+        <w:t xml:space="preserve"> </w:t>
+      </w:r>
+      <w:r>
+        <w:rPr>
+          <w:rFonts w:ascii="Noto Sans TC" w:eastAsia="Noto Sans TC" w:hAnsi="Noto Sans TC" w:cs="Noto Sans TC" w:hint="eastAsia"/>
+        </w:rPr>
+        <w:t>〬</w:t>
+      </w:r>
+      <w:r>
+        <w:rPr>
+          <w:rFonts w:ascii="KlarMinTC GenKiMerriMix PunctFi" w:eastAsia="KlarMinTC GenKiMerriMix PunctFi" w:hAnsi="KlarMinTC GenKiMerriMix PunctFi"/>
+        </w:rPr>
+        <w:t xml:space="preserve"> </w:t>
+      </w:r>
+      <w:r>
+        <w:rPr>
+          <w:rFonts w:ascii="Noto Sans TC" w:eastAsia="Noto Sans TC" w:hAnsi="Noto Sans TC" w:cs="Noto Sans TC" w:hint="eastAsia"/>
+        </w:rPr>
+        <w:t>〭</w:t>
+      </w:r>
+    </w:p>
+    <w:p>
+      <w:pPr>
+        <w:spacing w:after="0" w:line="0" w:lineRule="atLeast"/>
+        <w:rPr>
+          <w:rFonts w:ascii="KlarMinTC GenKiMerriMix PunctFi" w:eastAsia="KlarMinTC GenKiMerriMix PunctFi" w:hAnsi="KlarMinTC GenKiMerriMix PunctFi"/>
+        </w:rPr>
+      </w:pPr>
+    </w:p>
+    <w:p>
+      <w:pPr>
+        <w:spacing w:after="0" w:line="0" w:lineRule="atLeast"/>
+        <w:rPr>
+          <w:rFonts w:ascii="KlarMinTC GenKiMerriMix PunctFi" w:eastAsia="KlarMinTC GenKiMerriMix PunctFi" w:hAnsi="KlarMinTC GenKiMerriMix PunctFi"/>
+        </w:rPr>
+      </w:pPr>
+      <w:r>
+        <w:rPr>
+          <w:rFonts w:ascii="KlarMinTC GenKiMerriMix PunctFi" w:eastAsia="KlarMinTC GenKiMerriMix PunctFi" w:hAnsi="KlarMinTC GenKiMerriMix PunctFi" w:hint="eastAsia"/>
+        </w:rPr>
+        <w:t>【直排相關記號】</w:t>
+      </w:r>
+    </w:p>
+    <w:p>
+      <w:pPr>
+        <w:spacing w:after="0" w:line="0" w:lineRule="atLeast"/>
+        <w:rPr>
+          <w:rFonts w:ascii="KlarMinTC GenKiMerriMix PunctFi" w:eastAsia="KlarMinTC GenKiMerriMix PunctFi" w:hAnsi="KlarMinTC GenKiMerriMix PunctFi"/>
+        </w:rPr>
+      </w:pPr>
+      <w:r>
+        <w:rPr>
+          <w:rFonts w:ascii="Noto Sans TC" w:eastAsia="Noto Sans TC" w:hAnsi="Noto Sans TC" w:cs="Noto Sans TC" w:hint="eastAsia"/>
+        </w:rPr>
+        <w:t>〱</w:t>
+      </w:r>
+      <w:r>
+        <w:rPr>
+          <w:rFonts w:ascii="KlarMinTC GenKiMerriMix PunctFi" w:eastAsia="KlarMinTC GenKiMerriMix PunctFi" w:hAnsi="KlarMinTC GenKiMerriMix PunctFi"/>
+        </w:rPr>
+        <w:t xml:space="preserve"> </w:t>
+      </w:r>
+      <w:r>
+        <w:rPr>
+          <w:rFonts w:ascii="Noto Sans TC" w:eastAsia="Noto Sans TC" w:hAnsi="Noto Sans TC" w:cs="Noto Sans TC" w:hint="eastAsia"/>
+        </w:rPr>
+        <w:t>〲</w:t>
+      </w:r>
+    </w:p>
+    <w:p>
+      <w:pPr>
+        <w:spacing w:after="0" w:line="0" w:lineRule="atLeast"/>
+        <w:rPr>
+          <w:rFonts w:ascii="KlarMinTC GenKiMerriMix PunctFi" w:eastAsia="KlarMinTC GenKiMerriMix PunctFi" w:hAnsi="KlarMinTC GenKiMerriMix PunctFi"/>
+        </w:rPr>
+      </w:pPr>
+    </w:p>
+    <w:p>
+      <w:pPr>
+        <w:spacing w:after="0" w:line="0" w:lineRule="atLeast"/>
+        <w:rPr>
+          <w:rFonts w:ascii="KlarMinTC GenKiMerriMix PunctFi" w:eastAsia="KlarMinTC GenKiMerriMix PunctFi" w:hAnsi="KlarMinTC GenKiMerriMix PunctFi"/>
+        </w:rPr>
+      </w:pPr>
+      <w:r>
+        <w:rPr>
+          <w:rFonts w:ascii="KlarMinTC GenKiMerriMix PunctFi" w:eastAsia="KlarMinTC GenKiMerriMix PunctFi" w:hAnsi="KlarMinTC GenKiMerriMix PunctFi" w:hint="eastAsia"/>
+        </w:rPr>
+        <w:t>【半形與相近低探字】</w:t>
+      </w:r>
+    </w:p>
+    <w:p>
+      <w:pPr>
+        <w:spacing w:after="0" w:line="0" w:lineRule="atLeast"/>
+        <w:rPr>
+          <w:rFonts w:ascii="KlarMinTC GenKiMerriMix PunctFi" w:eastAsia="KlarMinTC GenKiMerriMix PunctFi" w:hAnsi="KlarMinTC GenKiMerriMix PunctFi"/>
+        </w:rPr>
+      </w:pPr>
+      <w:proofErr w:type="gramStart"/>
+      <w:r>
+        <w:rPr>
+          <w:rFonts w:ascii="KlarMinTC GenKiMerriMix PunctFi" w:eastAsia="KlarMinTC GenKiMerriMix PunctFi" w:hAnsi="KlarMinTC GenKiMerriMix PunctFi" w:hint="eastAsia"/>
+        </w:rPr>
+        <w:t>ｊ</w:t>
+      </w:r>
+      <w:proofErr w:type="gramEnd"/>
+      <w:r>
+        <w:rPr>
+          <w:rFonts w:ascii="KlarMinTC GenKiMerriMix PunctFi" w:eastAsia="KlarMinTC GenKiMerriMix PunctFi" w:hAnsi="KlarMinTC GenKiMerriMix PunctFi"/>
+        </w:rPr>
+        <w:t xml:space="preserve"> </w:t>
+      </w:r>
+      <w:proofErr w:type="gramStart"/>
+      <w:r>
+        <w:rPr>
+          <w:rFonts w:ascii="KlarMinTC GenKiMerriMix PunctFi" w:eastAsia="KlarMinTC GenKiMerriMix PunctFi" w:hAnsi="KlarMinTC GenKiMerriMix PunctFi" w:hint="eastAsia"/>
+        </w:rPr>
+        <w:t>ｙ</w:t>
+      </w:r>
+      <w:proofErr w:type="gramEnd"/>
+      <w:r>
+        <w:rPr>
+          <w:rFonts w:ascii="KlarMinTC GenKiMerriMix PunctFi" w:eastAsia="KlarMinTC GenKiMerriMix PunctFi" w:hAnsi="KlarMinTC GenKiMerriMix PunctFi"/>
+        </w:rPr>
+        <w:t xml:space="preserve"> </w:t>
+      </w:r>
+      <w:r>
+        <w:rPr>
+          <w:rFonts w:ascii="Noto Sans TC" w:eastAsia="Noto Sans TC" w:hAnsi="Noto Sans TC" w:cs="Noto Sans TC" w:hint="eastAsia"/>
+        </w:rPr>
+        <w:t>￨</w:t>
+      </w:r>
+    </w:p>
+    <w:p>
+      <w:pPr>
+        <w:spacing w:after="0" w:line="0" w:lineRule="atLeast"/>
+        <w:rPr>
+          <w:rFonts w:ascii="KlarMinTC GenKiMerriMix PunctFi" w:eastAsia="KlarMinTC GenKiMerriMix PunctFi" w:hAnsi="KlarMinTC GenKiMerriMix PunctFi"/>
+        </w:rPr>
+      </w:pPr>
+      <w:r>
+        <w:rPr>
+          <w:rFonts w:ascii="KlarMinTC GenKiMerriMix PunctFi" w:eastAsia="KlarMinTC GenKiMerriMix PunctFi" w:hAnsi="KlarMinTC GenKiMerriMix PunctFi"/>
+        </w:rPr>
+        <w:t>j y | g p q</w:t>
+      </w:r>
     </w:p>
     <w:p>
       <w:pPr>
@@ -243,6 +1540,7 @@
         <w:rPr>
           <w:rFonts w:ascii="KlarMinTC GenKiMerriMix PunctFi" w:eastAsia="KlarMinTC GenKiMerriMix PunctFi" w:hAnsi="KlarMinTC GenKiMerriMix PunctFi"/>
         </w:rPr>
+        <w:lastRenderedPageBreak/>
         <w:t>, . ' " - ! ? : ; ( ) [ ] { } / \ |</w:t>
       </w:r>
     </w:p>
@@ -251,95 +1549,31 @@
         <w:spacing w:after="0" w:line="0" w:lineRule="atLeast"/>
         <w:rPr>
           <w:rFonts w:ascii="KlarMinTC GenKiMerriMix PunctFi" w:eastAsia="KlarMinTC GenKiMerriMix PunctFi" w:hAnsi="KlarMinTC GenKiMerriMix PunctFi"/>
-        </w:rPr>
-      </w:pPr>
-      <w:proofErr w:type="spellStart"/>
-      <w:proofErr w:type="gramStart"/>
-      <w:r>
-        <w:rPr>
-          <w:rFonts w:ascii="KlarMinTC GenKiMerriMix PunctFi" w:eastAsia="KlarMinTC GenKiMerriMix PunctFi" w:hAnsi="KlarMinTC GenKiMerriMix PunctFi"/>
-        </w:rPr>
-        <w:t>a,b</w:t>
-      </w:r>
-      <w:proofErr w:type="spellEnd"/>
-      <w:r>
-        <w:rPr>
-          <w:rFonts w:ascii="KlarMinTC GenKiMerriMix PunctFi" w:eastAsia="KlarMinTC GenKiMerriMix PunctFi" w:hAnsi="KlarMinTC GenKiMerriMix PunctFi"/>
-        </w:rPr>
-        <w:t>.</w:t>
-      </w:r>
-      <w:proofErr w:type="gramEnd"/>
-      <w:r>
-        <w:rPr>
-          <w:rFonts w:ascii="KlarMinTC GenKiMerriMix PunctFi" w:eastAsia="KlarMinTC GenKiMerriMix PunctFi" w:hAnsi="KlarMinTC GenKiMerriMix PunctFi"/>
-        </w:rPr>
-        <w:t xml:space="preserve"> </w:t>
-      </w:r>
-      <w:proofErr w:type="spellStart"/>
-      <w:r>
-        <w:rPr>
-          <w:rFonts w:ascii="KlarMinTC GenKiMerriMix PunctFi" w:eastAsia="KlarMinTC GenKiMerriMix PunctFi" w:hAnsi="KlarMinTC GenKiMerriMix PunctFi"/>
-        </w:rPr>
-        <w:t>c'd</w:t>
-      </w:r>
-      <w:proofErr w:type="spellEnd"/>
-      <w:r>
-        <w:rPr>
-          <w:rFonts w:ascii="KlarMinTC GenKiMerriMix PunctFi" w:eastAsia="KlarMinTC GenKiMerriMix PunctFi" w:hAnsi="KlarMinTC GenKiMerriMix PunctFi"/>
-        </w:rPr>
-        <w:t xml:space="preserve"> "e" f-g! h? </w:t>
-      </w:r>
-      <w:proofErr w:type="gramStart"/>
-      <w:r>
-        <w:rPr>
-          <w:rFonts w:ascii="KlarMinTC GenKiMerriMix PunctFi" w:eastAsia="KlarMinTC GenKiMerriMix PunctFi" w:hAnsi="KlarMinTC GenKiMerriMix PunctFi"/>
-        </w:rPr>
-        <w:t>i:j</w:t>
-      </w:r>
-      <w:proofErr w:type="gramEnd"/>
-      <w:r>
-        <w:rPr>
-          <w:rFonts w:ascii="KlarMinTC GenKiMerriMix PunctFi" w:eastAsia="KlarMinTC GenKiMerriMix PunctFi" w:hAnsi="KlarMinTC GenKiMerriMix PunctFi"/>
-        </w:rPr>
-        <w:t xml:space="preserve">; (k) [l] {m} /n/ \o\ </w:t>
-      </w:r>
-      <w:proofErr w:type="spellStart"/>
-      <w:r>
-        <w:rPr>
-          <w:rFonts w:ascii="KlarMinTC GenKiMerriMix PunctFi" w:eastAsia="KlarMinTC GenKiMerriMix PunctFi" w:hAnsi="KlarMinTC GenKiMerriMix PunctFi"/>
-        </w:rPr>
-        <w:t>p|q</w:t>
-      </w:r>
-      <w:proofErr w:type="spellEnd"/>
-    </w:p>
-    <w:p>
-      <w:pPr>
-        <w:spacing w:after="0" w:line="0" w:lineRule="atLeast"/>
-        <w:rPr>
-          <w:rFonts w:ascii="KlarMinTC GenKiMerriMix PunctFi" w:eastAsia="KlarMinTC GenKiMerriMix PunctFi" w:hAnsi="KlarMinTC GenKiMerriMix PunctFi"/>
           <w:lang w:val="it-IT"/>
         </w:rPr>
       </w:pPr>
-      <w:proofErr w:type="gramStart"/>
-      <w:r>
-        <w:rPr>
-          <w:rFonts w:ascii="KlarMinTC GenKiMerriMix PunctFi" w:eastAsia="KlarMinTC GenKiMerriMix PunctFi" w:hAnsi="KlarMinTC GenKiMerriMix PunctFi"/>
-        </w:rPr>
-        <w:t>A,B.</w:t>
-      </w:r>
-      <w:proofErr w:type="gramEnd"/>
-      <w:r>
-        <w:rPr>
-          <w:rFonts w:ascii="KlarMinTC GenKiMerriMix PunctFi" w:eastAsia="KlarMinTC GenKiMerriMix PunctFi" w:hAnsi="KlarMinTC GenKiMerriMix PunctFi"/>
-        </w:rPr>
-        <w:t xml:space="preserve"> C'D "E" F-G! </w:t>
-      </w:r>
       <w:r>
         <w:rPr>
           <w:rFonts w:ascii="KlarMinTC GenKiMerriMix PunctFi" w:eastAsia="KlarMinTC GenKiMerriMix PunctFi" w:hAnsi="KlarMinTC GenKiMerriMix PunctFi"/>
           <w:lang w:val="it-IT"/>
         </w:rPr>
-        <w:t>H? I:J; (K) [L] {M} /N/ \O\ P|Q</w:t>
+        <w:t>a,b. c'd "e" f-g! h? i:j; (k) [l] {m} /n/ \o\ p|q</w:t>
+      </w:r>
+    </w:p>
+    <w:p>
+      <w:pPr>
+        <w:spacing w:after="0" w:line="0" w:lineRule="atLeast"/>
+        <w:rPr>
+          <w:rFonts w:ascii="KlarMinTC GenKiMerriMix PunctFi" w:eastAsia="KlarMinTC GenKiMerriMix PunctFi" w:hAnsi="KlarMinTC GenKiMerriMix PunctFi"/>
+          <w:lang w:val="it-IT"/>
+        </w:rPr>
+      </w:pPr>
+      <w:r>
+        <w:rPr>
+          <w:rFonts w:ascii="KlarMinTC GenKiMerriMix PunctFi" w:eastAsia="KlarMinTC GenKiMerriMix PunctFi" w:hAnsi="KlarMinTC GenKiMerriMix PunctFi"/>
+          <w:lang w:val="it-IT"/>
+        </w:rPr>
+        <w:t>A,B. C'D "E" F-G! H? I:J; (K) [L] {M} /N/ \O\ P|Q</w:t>
       </w:r>
     </w:p>
     <w:p>
@@ -474,633 +1708,633 @@
         <w:rPr>
           <w:rFonts w:ascii="Times New Roman" w:eastAsia="KlarMinTC GenKiMerriMix PunctFi" w:hAnsi="Times New Roman" w:cs="Times New Roman"/>
         </w:rPr>
+        <w:t>‹</w:t>
+      </w:r>
+      <w:r>
+        <w:rPr>
+          <w:rFonts w:ascii="KlarMinTC GenKiMerriMix PunctFi" w:eastAsia="KlarMinTC GenKiMerriMix PunctFi" w:hAnsi="KlarMinTC GenKiMerriMix PunctFi"/>
+        </w:rPr>
+        <w:t>angle</w:t>
+      </w:r>
+      <w:r>
+        <w:rPr>
+          <w:rFonts w:ascii="Times New Roman" w:eastAsia="KlarMinTC GenKiMerriMix PunctFi" w:hAnsi="Times New Roman" w:cs="Times New Roman"/>
+        </w:rPr>
+        <w:t>‹</w:t>
+      </w:r>
+      <w:r>
+        <w:rPr>
+          <w:rFonts w:ascii="KlarMinTC GenKiMerriMix PunctFi" w:eastAsia="KlarMinTC GenKiMerriMix PunctFi" w:hAnsi="KlarMinTC GenKiMerriMix PunctFi"/>
+        </w:rPr>
+        <w:t xml:space="preserve"> </w:t>
+      </w:r>
+      <w:r>
+        <w:rPr>
+          <w:rFonts w:ascii="Times New Roman" w:eastAsia="KlarMinTC GenKiMerriMix PunctFi" w:hAnsi="Times New Roman" w:cs="Times New Roman"/>
+        </w:rPr>
+        <w:t>›</w:t>
+      </w:r>
+      <w:r>
+        <w:rPr>
+          <w:rFonts w:ascii="KlarMinTC GenKiMerriMix PunctFi" w:eastAsia="KlarMinTC GenKiMerriMix PunctFi" w:hAnsi="KlarMinTC GenKiMerriMix PunctFi"/>
+        </w:rPr>
+        <w:t>angle</w:t>
+      </w:r>
+      <w:r>
+        <w:rPr>
+          <w:rFonts w:ascii="Times New Roman" w:eastAsia="KlarMinTC GenKiMerriMix PunctFi" w:hAnsi="Times New Roman" w:cs="Times New Roman"/>
+        </w:rPr>
+        <w:t>›</w:t>
+      </w:r>
+    </w:p>
+    <w:p>
+      <w:pPr>
+        <w:spacing w:after="0" w:line="0" w:lineRule="atLeast"/>
+        <w:rPr>
+          <w:rFonts w:ascii="KlarMinTC GenKiMerriMix PunctFi" w:eastAsia="KlarMinTC GenKiMerriMix PunctFi" w:hAnsi="KlarMinTC GenKiMerriMix PunctFi"/>
+        </w:rPr>
+      </w:pPr>
+      <w:r>
+        <w:rPr>
+          <w:rFonts w:ascii="KlarMinTC GenKiMerriMix PunctFi" w:eastAsia="KlarMinTC GenKiMerriMix PunctFi" w:hAnsi="KlarMinTC GenKiMerriMix PunctFi"/>
+        </w:rPr>
+        <w:t>prime: 5′ 10</w:t>
+      </w:r>
+      <w:r>
+        <w:rPr>
+          <w:rFonts w:ascii="Times New Roman" w:eastAsia="KlarMinTC GenKiMerriMix PunctFi" w:hAnsi="Times New Roman" w:cs="Times New Roman"/>
+        </w:rPr>
+        <w:t>″</w:t>
+      </w:r>
+    </w:p>
+    <w:p>
+      <w:pPr>
+        <w:spacing w:after="0" w:line="0" w:lineRule="atLeast"/>
+        <w:rPr>
+          <w:rFonts w:ascii="KlarMinTC GenKiMerriMix PunctFi" w:eastAsia="KlarMinTC GenKiMerriMix PunctFi" w:hAnsi="KlarMinTC GenKiMerriMix PunctFi"/>
+        </w:rPr>
+      </w:pPr>
+      <w:r>
+        <w:rPr>
+          <w:rFonts w:ascii="KlarMinTC GenKiMerriMix PunctFi" w:eastAsia="KlarMinTC GenKiMerriMix PunctFi" w:hAnsi="KlarMinTC GenKiMerriMix PunctFi"/>
+        </w:rPr>
+        <w:t xml:space="preserve">warning: </w:t>
+      </w:r>
+      <w:r>
+        <w:rPr>
+          <w:rFonts w:ascii="Times New Roman" w:eastAsia="KlarMinTC GenKiMerriMix PunctFi" w:hAnsi="Times New Roman" w:cs="Times New Roman"/>
+        </w:rPr>
+        <w:t>‼</w:t>
+      </w:r>
+    </w:p>
+    <w:p>
+      <w:pPr>
+        <w:spacing w:after="0" w:line="0" w:lineRule="atLeast"/>
+        <w:rPr>
+          <w:rFonts w:ascii="KlarMinTC GenKiMerriMix PunctFi" w:eastAsia="KlarMinTC GenKiMerriMix PunctFi" w:hAnsi="KlarMinTC GenKiMerriMix PunctFi"/>
+        </w:rPr>
+      </w:pPr>
+      <w:r>
+        <w:rPr>
+          <w:rFonts w:ascii="KlarMinTC GenKiMerriMix PunctFi" w:eastAsia="KlarMinTC GenKiMerriMix PunctFi" w:hAnsi="KlarMinTC GenKiMerriMix PunctFi"/>
+        </w:rPr>
+        <w:t xml:space="preserve">quote test: ‘A’, “B”, </w:t>
+      </w:r>
+      <w:r>
+        <w:rPr>
+          <w:rFonts w:ascii="Times New Roman" w:eastAsia="KlarMinTC GenKiMerriMix PunctFi" w:hAnsi="Times New Roman" w:cs="Times New Roman"/>
+        </w:rPr>
+        <w:t>‚</w:t>
+      </w:r>
+      <w:r>
+        <w:rPr>
+          <w:rFonts w:ascii="KlarMinTC GenKiMerriMix PunctFi" w:eastAsia="KlarMinTC GenKiMerriMix PunctFi" w:hAnsi="KlarMinTC GenKiMerriMix PunctFi"/>
+        </w:rPr>
+        <w:t>C</w:t>
+      </w:r>
+      <w:r>
+        <w:rPr>
+          <w:rFonts w:ascii="KlarMinTC GenKiMerriMix PunctFi" w:eastAsia="KlarMinTC GenKiMerriMix PunctFi" w:hAnsi="KlarMinTC GenKiMerriMix PunctFi" w:cs="KlarMinTC GenKiMerriMix PunctFi" w:hint="eastAsia"/>
+        </w:rPr>
+        <w:t>’</w:t>
+      </w:r>
+      <w:r>
+        <w:rPr>
+          <w:rFonts w:ascii="KlarMinTC GenKiMerriMix PunctFi" w:eastAsia="KlarMinTC GenKiMerriMix PunctFi" w:hAnsi="KlarMinTC GenKiMerriMix PunctFi"/>
+        </w:rPr>
+        <w:t xml:space="preserve">, </w:t>
+      </w:r>
+      <w:r>
+        <w:rPr>
+          <w:rFonts w:ascii="Times New Roman" w:eastAsia="KlarMinTC GenKiMerriMix PunctFi" w:hAnsi="Times New Roman" w:cs="Times New Roman"/>
+        </w:rPr>
+        <w:t>„</w:t>
+      </w:r>
+      <w:r>
+        <w:rPr>
+          <w:rFonts w:ascii="KlarMinTC GenKiMerriMix PunctFi" w:eastAsia="KlarMinTC GenKiMerriMix PunctFi" w:hAnsi="KlarMinTC GenKiMerriMix PunctFi"/>
+        </w:rPr>
+        <w:t>D</w:t>
+      </w:r>
+      <w:r>
+        <w:rPr>
+          <w:rFonts w:ascii="KlarMinTC GenKiMerriMix PunctFi" w:eastAsia="KlarMinTC GenKiMerriMix PunctFi" w:hAnsi="KlarMinTC GenKiMerriMix PunctFi" w:cs="KlarMinTC GenKiMerriMix PunctFi" w:hint="eastAsia"/>
+        </w:rPr>
+        <w:t>”</w:t>
+      </w:r>
+      <w:r>
+        <w:rPr>
+          <w:rFonts w:ascii="KlarMinTC GenKiMerriMix PunctFi" w:eastAsia="KlarMinTC GenKiMerriMix PunctFi" w:hAnsi="KlarMinTC GenKiMerriMix PunctFi"/>
+        </w:rPr>
+        <w:t xml:space="preserve">, </w:t>
+      </w:r>
+      <w:r>
+        <w:rPr>
+          <w:rFonts w:ascii="Times New Roman" w:eastAsia="KlarMinTC GenKiMerriMix PunctFi" w:hAnsi="Times New Roman" w:cs="Times New Roman"/>
+        </w:rPr>
+        <w:t>‹</w:t>
+      </w:r>
+      <w:r>
+        <w:rPr>
+          <w:rFonts w:ascii="KlarMinTC GenKiMerriMix PunctFi" w:eastAsia="KlarMinTC GenKiMerriMix PunctFi" w:hAnsi="KlarMinTC GenKiMerriMix PunctFi"/>
+        </w:rPr>
+        <w:t>E</w:t>
+      </w:r>
+      <w:r>
+        <w:rPr>
+          <w:rFonts w:ascii="Times New Roman" w:eastAsia="KlarMinTC GenKiMerriMix PunctFi" w:hAnsi="Times New Roman" w:cs="Times New Roman"/>
+        </w:rPr>
+        <w:t>›</w:t>
+      </w:r>
+    </w:p>
+    <w:p>
+      <w:pPr>
+        <w:spacing w:after="0" w:line="0" w:lineRule="atLeast"/>
+        <w:rPr>
+          <w:rFonts w:ascii="KlarMinTC GenKiMerriMix PunctFi" w:eastAsia="KlarMinTC GenKiMerriMix PunctFi" w:hAnsi="KlarMinTC GenKiMerriMix PunctFi"/>
+        </w:rPr>
+      </w:pPr>
+    </w:p>
+    <w:p>
+      <w:pPr>
+        <w:spacing w:after="0" w:line="0" w:lineRule="atLeast"/>
+        <w:rPr>
+          <w:rFonts w:ascii="KlarMinTC GenKiMerriMix PunctFi" w:eastAsia="KlarMinTC GenKiMerriMix PunctFi" w:hAnsi="KlarMinTC GenKiMerriMix PunctFi"/>
+        </w:rPr>
+      </w:pPr>
+      <w:r>
+        <w:rPr>
+          <w:rFonts w:ascii="KlarMinTC GenKiMerriMix PunctFi" w:eastAsia="KlarMinTC GenKiMerriMix PunctFi" w:hAnsi="KlarMinTC GenKiMerriMix PunctFi"/>
+        </w:rPr>
+        <w:t>全形常用標點：</w:t>
+      </w:r>
+    </w:p>
+    <w:p>
+      <w:pPr>
+        <w:spacing w:after="0" w:line="0" w:lineRule="atLeast"/>
+        <w:rPr>
+          <w:rFonts w:ascii="KlarMinTC GenKiMerriMix PunctFi" w:eastAsia="KlarMinTC GenKiMerriMix PunctFi" w:hAnsi="KlarMinTC GenKiMerriMix PunctFi"/>
+        </w:rPr>
+      </w:pPr>
+      <w:r>
+        <w:rPr>
+          <w:rFonts w:ascii="KlarMinTC GenKiMerriMix PunctFi" w:eastAsia="KlarMinTC GenKiMerriMix PunctFi" w:hAnsi="KlarMinTC GenKiMerriMix PunctFi"/>
+        </w:rPr>
+        <w:t xml:space="preserve">， 。 、 ； ： ！ ？ （ ） 【 】 〔 〕 「 」 『 』 《 》 〈 〉 ／ </w:t>
+      </w:r>
+      <w:proofErr w:type="gramStart"/>
+      <w:r>
+        <w:rPr>
+          <w:rFonts w:ascii="KlarMinTC GenKiMerriMix PunctFi" w:eastAsia="KlarMinTC GenKiMerriMix PunctFi" w:hAnsi="KlarMinTC GenKiMerriMix PunctFi"/>
+        </w:rPr>
+        <w:t>＼</w:t>
+      </w:r>
+      <w:proofErr w:type="gramEnd"/>
+      <w:r>
+        <w:rPr>
+          <w:rFonts w:ascii="KlarMinTC GenKiMerriMix PunctFi" w:eastAsia="KlarMinTC GenKiMerriMix PunctFi" w:hAnsi="KlarMinTC GenKiMerriMix PunctFi"/>
+        </w:rPr>
+        <w:t xml:space="preserve"> </w:t>
+      </w:r>
+      <w:proofErr w:type="gramStart"/>
+      <w:r>
+        <w:rPr>
+          <w:rFonts w:ascii="KlarMinTC GenKiMerriMix PunctFi" w:eastAsia="KlarMinTC GenKiMerriMix PunctFi" w:hAnsi="KlarMinTC GenKiMerriMix PunctFi"/>
+        </w:rPr>
+        <w:t>｜</w:t>
+      </w:r>
+      <w:proofErr w:type="gramEnd"/>
+      <w:r>
+        <w:rPr>
+          <w:rFonts w:ascii="KlarMinTC GenKiMerriMix PunctFi" w:eastAsia="KlarMinTC GenKiMerriMix PunctFi" w:hAnsi="KlarMinTC GenKiMerriMix PunctFi"/>
+        </w:rPr>
+        <w:t xml:space="preserve"> ～ </w:t>
+      </w:r>
+      <w:proofErr w:type="gramStart"/>
+      <w:r>
+        <w:rPr>
+          <w:rFonts w:ascii="新細明體" w:eastAsia="新細明體" w:hAnsi="新細明體" w:cs="新細明體" w:hint="eastAsia"/>
+        </w:rPr>
+        <w:t>｀</w:t>
+      </w:r>
+      <w:proofErr w:type="gramEnd"/>
+      <w:r>
+        <w:rPr>
+          <w:rFonts w:ascii="KlarMinTC GenKiMerriMix PunctFi" w:eastAsia="KlarMinTC GenKiMerriMix PunctFi" w:hAnsi="KlarMinTC GenKiMerriMix PunctFi"/>
+        </w:rPr>
+        <w:t xml:space="preserve"> ．</w:t>
+      </w:r>
+    </w:p>
+    <w:p>
+      <w:pPr>
+        <w:spacing w:after="0" w:line="0" w:lineRule="atLeast"/>
+        <w:rPr>
+          <w:rFonts w:ascii="KlarMinTC GenKiMerriMix PunctFi" w:eastAsia="KlarMinTC GenKiMerriMix PunctFi" w:hAnsi="KlarMinTC GenKiMerriMix PunctFi"/>
+        </w:rPr>
+      </w:pPr>
+      <w:r>
+        <w:rPr>
+          <w:rFonts w:ascii="KlarMinTC GenKiMerriMix PunctFi" w:eastAsia="KlarMinTC GenKiMerriMix PunctFi" w:hAnsi="KlarMinTC GenKiMerriMix PunctFi"/>
+        </w:rPr>
+        <w:t>中文「引號」與『雙層引號』，還有（圓括號）、【方頭括號】、〈尖括號〉、《書名號》都要看起來穩定。</w:t>
+      </w:r>
+    </w:p>
+    <w:p>
+      <w:pPr>
+        <w:spacing w:after="0" w:line="0" w:lineRule="atLeast"/>
+        <w:rPr>
+          <w:rFonts w:ascii="KlarMinTC GenKiMerriMix PunctFi" w:eastAsia="KlarMinTC GenKiMerriMix PunctFi" w:hAnsi="KlarMinTC GenKiMerriMix PunctFi"/>
+        </w:rPr>
+      </w:pPr>
+    </w:p>
+    <w:p>
+      <w:pPr>
+        <w:spacing w:after="0" w:line="0" w:lineRule="atLeast"/>
+        <w:rPr>
+          <w:rFonts w:ascii="KlarMinTC GenKiMerriMix PunctFi" w:eastAsia="KlarMinTC GenKiMerriMix PunctFi" w:hAnsi="KlarMinTC GenKiMerriMix PunctFi"/>
+        </w:rPr>
+      </w:pPr>
+      <w:r>
+        <w:rPr>
+          <w:rFonts w:ascii="KlarMinTC GenKiMerriMix PunctFi" w:eastAsia="KlarMinTC GenKiMerriMix PunctFi" w:hAnsi="KlarMinTC GenKiMerriMix PunctFi"/>
+        </w:rPr>
+        <w:t>全半形對照：</w:t>
+      </w:r>
+    </w:p>
+    <w:p>
+      <w:pPr>
+        <w:spacing w:after="0" w:line="0" w:lineRule="atLeast"/>
+        <w:rPr>
+          <w:rFonts w:ascii="KlarMinTC GenKiMerriMix PunctFi" w:eastAsia="KlarMinTC GenKiMerriMix PunctFi" w:hAnsi="KlarMinTC GenKiMerriMix PunctFi"/>
+        </w:rPr>
+      </w:pPr>
+      <w:r>
+        <w:rPr>
+          <w:rFonts w:ascii="KlarMinTC GenKiMerriMix PunctFi" w:eastAsia="KlarMinTC GenKiMerriMix PunctFi" w:hAnsi="KlarMinTC GenKiMerriMix PunctFi"/>
+        </w:rPr>
+        <w:t>, ，</w:t>
+      </w:r>
+    </w:p>
+    <w:p>
+      <w:pPr>
+        <w:spacing w:after="0" w:line="0" w:lineRule="atLeast"/>
+        <w:rPr>
+          <w:rFonts w:ascii="KlarMinTC GenKiMerriMix PunctFi" w:eastAsia="KlarMinTC GenKiMerriMix PunctFi" w:hAnsi="KlarMinTC GenKiMerriMix PunctFi"/>
+        </w:rPr>
+      </w:pPr>
+      <w:r>
+        <w:rPr>
+          <w:rFonts w:ascii="KlarMinTC GenKiMerriMix PunctFi" w:eastAsia="KlarMinTC GenKiMerriMix PunctFi" w:hAnsi="KlarMinTC GenKiMerriMix PunctFi"/>
+        </w:rPr>
+        <w:t>. 。</w:t>
+      </w:r>
+    </w:p>
+    <w:p>
+      <w:pPr>
+        <w:spacing w:after="0" w:line="0" w:lineRule="atLeast"/>
+        <w:rPr>
+          <w:rFonts w:ascii="KlarMinTC GenKiMerriMix PunctFi" w:eastAsia="KlarMinTC GenKiMerriMix PunctFi" w:hAnsi="KlarMinTC GenKiMerriMix PunctFi"/>
+        </w:rPr>
+      </w:pPr>
+      <w:r>
+        <w:rPr>
+          <w:rFonts w:ascii="KlarMinTC GenKiMerriMix PunctFi" w:eastAsia="KlarMinTC GenKiMerriMix PunctFi" w:hAnsi="KlarMinTC GenKiMerriMix PunctFi"/>
+        </w:rPr>
+        <w:t>: ：</w:t>
+      </w:r>
+    </w:p>
+    <w:p>
+      <w:pPr>
+        <w:spacing w:after="0" w:line="0" w:lineRule="atLeast"/>
+        <w:rPr>
+          <w:rFonts w:ascii="KlarMinTC GenKiMerriMix PunctFi" w:eastAsia="KlarMinTC GenKiMerriMix PunctFi" w:hAnsi="KlarMinTC GenKiMerriMix PunctFi"/>
+        </w:rPr>
+      </w:pPr>
+      <w:r>
+        <w:rPr>
+          <w:rFonts w:ascii="KlarMinTC GenKiMerriMix PunctFi" w:eastAsia="KlarMinTC GenKiMerriMix PunctFi" w:hAnsi="KlarMinTC GenKiMerriMix PunctFi"/>
+        </w:rPr>
+        <w:t>; ；</w:t>
+      </w:r>
+    </w:p>
+    <w:p>
+      <w:pPr>
+        <w:spacing w:after="0" w:line="0" w:lineRule="atLeast"/>
+        <w:rPr>
+          <w:rFonts w:ascii="KlarMinTC GenKiMerriMix PunctFi" w:eastAsia="KlarMinTC GenKiMerriMix PunctFi" w:hAnsi="KlarMinTC GenKiMerriMix PunctFi"/>
+        </w:rPr>
+      </w:pPr>
+      <w:r>
+        <w:rPr>
+          <w:rFonts w:ascii="KlarMinTC GenKiMerriMix PunctFi" w:eastAsia="KlarMinTC GenKiMerriMix PunctFi" w:hAnsi="KlarMinTC GenKiMerriMix PunctFi"/>
+        </w:rPr>
+        <w:t>! ！</w:t>
+      </w:r>
+    </w:p>
+    <w:p>
+      <w:pPr>
+        <w:spacing w:after="0" w:line="0" w:lineRule="atLeast"/>
+        <w:rPr>
+          <w:rFonts w:ascii="KlarMinTC GenKiMerriMix PunctFi" w:eastAsia="KlarMinTC GenKiMerriMix PunctFi" w:hAnsi="KlarMinTC GenKiMerriMix PunctFi"/>
+        </w:rPr>
+      </w:pPr>
+      <w:r>
+        <w:rPr>
+          <w:rFonts w:ascii="KlarMinTC GenKiMerriMix PunctFi" w:eastAsia="KlarMinTC GenKiMerriMix PunctFi" w:hAnsi="KlarMinTC GenKiMerriMix PunctFi"/>
+        </w:rPr>
+        <w:t>? ？</w:t>
+      </w:r>
+    </w:p>
+    <w:p>
+      <w:pPr>
+        <w:spacing w:after="0" w:line="0" w:lineRule="atLeast"/>
+        <w:rPr>
+          <w:rFonts w:ascii="KlarMinTC GenKiMerriMix PunctFi" w:eastAsia="KlarMinTC GenKiMerriMix PunctFi" w:hAnsi="KlarMinTC GenKiMerriMix PunctFi"/>
+        </w:rPr>
+      </w:pPr>
+      <w:r>
+        <w:rPr>
+          <w:rFonts w:ascii="KlarMinTC GenKiMerriMix PunctFi" w:eastAsia="KlarMinTC GenKiMerriMix PunctFi" w:hAnsi="KlarMinTC GenKiMerriMix PunctFi"/>
+        </w:rPr>
+        <w:t xml:space="preserve">( </w:t>
+      </w:r>
+      <w:proofErr w:type="gramStart"/>
+      <w:r>
+        <w:rPr>
+          <w:rFonts w:ascii="KlarMinTC GenKiMerriMix PunctFi" w:eastAsia="KlarMinTC GenKiMerriMix PunctFi" w:hAnsi="KlarMinTC GenKiMerriMix PunctFi"/>
+        </w:rPr>
+        <w:t>（</w:t>
+      </w:r>
+      <w:proofErr w:type="gramEnd"/>
+    </w:p>
+    <w:p>
+      <w:pPr>
+        <w:spacing w:after="0" w:line="0" w:lineRule="atLeast"/>
+        <w:rPr>
+          <w:rFonts w:ascii="KlarMinTC GenKiMerriMix PunctFi" w:eastAsia="KlarMinTC GenKiMerriMix PunctFi" w:hAnsi="KlarMinTC GenKiMerriMix PunctFi"/>
+        </w:rPr>
+      </w:pPr>
+      <w:r>
+        <w:rPr>
+          <w:rFonts w:ascii="KlarMinTC GenKiMerriMix PunctFi" w:eastAsia="KlarMinTC GenKiMerriMix PunctFi" w:hAnsi="KlarMinTC GenKiMerriMix PunctFi"/>
+        </w:rPr>
+        <w:t xml:space="preserve">) </w:t>
+      </w:r>
+      <w:proofErr w:type="gramStart"/>
+      <w:r>
+        <w:rPr>
+          <w:rFonts w:ascii="KlarMinTC GenKiMerriMix PunctFi" w:eastAsia="KlarMinTC GenKiMerriMix PunctFi" w:hAnsi="KlarMinTC GenKiMerriMix PunctFi"/>
+        </w:rPr>
+        <w:t>）</w:t>
+      </w:r>
+      <w:proofErr w:type="gramEnd"/>
+    </w:p>
+    <w:p>
+      <w:pPr>
+        <w:spacing w:after="0" w:line="0" w:lineRule="atLeast"/>
+        <w:rPr>
+          <w:rFonts w:ascii="KlarMinTC GenKiMerriMix PunctFi" w:eastAsia="KlarMinTC GenKiMerriMix PunctFi" w:hAnsi="KlarMinTC GenKiMerriMix PunctFi"/>
+        </w:rPr>
+      </w:pPr>
+      <w:r>
+        <w:rPr>
+          <w:rFonts w:ascii="KlarMinTC GenKiMerriMix PunctFi" w:eastAsia="KlarMinTC GenKiMerriMix PunctFi" w:hAnsi="KlarMinTC GenKiMerriMix PunctFi"/>
+        </w:rPr>
+        <w:t xml:space="preserve">[ </w:t>
+      </w:r>
+      <w:proofErr w:type="gramStart"/>
+      <w:r>
+        <w:rPr>
+          <w:rFonts w:ascii="KlarMinTC GenKiMerriMix PunctFi" w:eastAsia="KlarMinTC GenKiMerriMix PunctFi" w:hAnsi="KlarMinTC GenKiMerriMix PunctFi"/>
+        </w:rPr>
+        <w:t>【</w:t>
+      </w:r>
+      <w:proofErr w:type="gramEnd"/>
+    </w:p>
+    <w:p>
+      <w:pPr>
+        <w:spacing w:after="0" w:line="0" w:lineRule="atLeast"/>
+        <w:rPr>
+          <w:rFonts w:ascii="KlarMinTC GenKiMerriMix PunctFi" w:eastAsia="KlarMinTC GenKiMerriMix PunctFi" w:hAnsi="KlarMinTC GenKiMerriMix PunctFi"/>
+        </w:rPr>
+      </w:pPr>
+      <w:r>
+        <w:rPr>
+          <w:rFonts w:ascii="KlarMinTC GenKiMerriMix PunctFi" w:eastAsia="KlarMinTC GenKiMerriMix PunctFi" w:hAnsi="KlarMinTC GenKiMerriMix PunctFi"/>
+        </w:rPr>
+        <w:t xml:space="preserve">] </w:t>
+      </w:r>
+      <w:proofErr w:type="gramStart"/>
+      <w:r>
+        <w:rPr>
+          <w:rFonts w:ascii="KlarMinTC GenKiMerriMix PunctFi" w:eastAsia="KlarMinTC GenKiMerriMix PunctFi" w:hAnsi="KlarMinTC GenKiMerriMix PunctFi"/>
+        </w:rPr>
+        <w:t>】</w:t>
+      </w:r>
+      <w:proofErr w:type="gramEnd"/>
+    </w:p>
+    <w:p>
+      <w:pPr>
+        <w:spacing w:after="0" w:line="0" w:lineRule="atLeast"/>
+        <w:rPr>
+          <w:rFonts w:ascii="KlarMinTC GenKiMerriMix PunctFi" w:eastAsia="KlarMinTC GenKiMerriMix PunctFi" w:hAnsi="KlarMinTC GenKiMerriMix PunctFi"/>
+        </w:rPr>
+      </w:pPr>
+      <w:r>
+        <w:rPr>
+          <w:rFonts w:ascii="KlarMinTC GenKiMerriMix PunctFi" w:eastAsia="KlarMinTC GenKiMerriMix PunctFi" w:hAnsi="KlarMinTC GenKiMerriMix PunctFi"/>
+        </w:rPr>
+        <w:t xml:space="preserve">{ </w:t>
+      </w:r>
+      <w:proofErr w:type="gramStart"/>
+      <w:r>
+        <w:rPr>
+          <w:rFonts w:ascii="KlarMinTC GenKiMerriMix PunctFi" w:eastAsia="KlarMinTC GenKiMerriMix PunctFi" w:hAnsi="KlarMinTC GenKiMerriMix PunctFi"/>
+        </w:rPr>
+        <w:t>〔</w:t>
+      </w:r>
+      <w:proofErr w:type="gramEnd"/>
+    </w:p>
+    <w:p>
+      <w:pPr>
+        <w:spacing w:after="0" w:line="0" w:lineRule="atLeast"/>
+        <w:rPr>
+          <w:rFonts w:ascii="KlarMinTC GenKiMerriMix PunctFi" w:eastAsia="KlarMinTC GenKiMerriMix PunctFi" w:hAnsi="KlarMinTC GenKiMerriMix PunctFi"/>
+        </w:rPr>
+      </w:pPr>
+      <w:r>
+        <w:rPr>
+          <w:rFonts w:ascii="KlarMinTC GenKiMerriMix PunctFi" w:eastAsia="KlarMinTC GenKiMerriMix PunctFi" w:hAnsi="KlarMinTC GenKiMerriMix PunctFi"/>
+        </w:rPr>
+        <w:t xml:space="preserve">} </w:t>
+      </w:r>
+      <w:proofErr w:type="gramStart"/>
+      <w:r>
+        <w:rPr>
+          <w:rFonts w:ascii="KlarMinTC GenKiMerriMix PunctFi" w:eastAsia="KlarMinTC GenKiMerriMix PunctFi" w:hAnsi="KlarMinTC GenKiMerriMix PunctFi"/>
+        </w:rPr>
+        <w:t>〕</w:t>
+      </w:r>
+      <w:proofErr w:type="gramEnd"/>
+    </w:p>
+    <w:p>
+      <w:pPr>
+        <w:spacing w:after="0" w:line="0" w:lineRule="atLeast"/>
+        <w:rPr>
+          <w:rFonts w:ascii="KlarMinTC GenKiMerriMix PunctFi" w:eastAsia="KlarMinTC GenKiMerriMix PunctFi" w:hAnsi="KlarMinTC GenKiMerriMix PunctFi"/>
+        </w:rPr>
+      </w:pPr>
+      <w:r>
+        <w:rPr>
+          <w:rFonts w:ascii="KlarMinTC GenKiMerriMix PunctFi" w:eastAsia="KlarMinTC GenKiMerriMix PunctFi" w:hAnsi="KlarMinTC GenKiMerriMix PunctFi"/>
+        </w:rPr>
+        <w:t>/ ／</w:t>
+      </w:r>
+    </w:p>
+    <w:p>
+      <w:pPr>
+        <w:spacing w:after="0" w:line="0" w:lineRule="atLeast"/>
+        <w:rPr>
+          <w:rFonts w:ascii="KlarMinTC GenKiMerriMix PunctFi" w:eastAsia="KlarMinTC GenKiMerriMix PunctFi" w:hAnsi="KlarMinTC GenKiMerriMix PunctFi"/>
+        </w:rPr>
+      </w:pPr>
+      <w:r>
+        <w:rPr>
+          <w:rFonts w:ascii="KlarMinTC GenKiMerriMix PunctFi" w:eastAsia="KlarMinTC GenKiMerriMix PunctFi" w:hAnsi="KlarMinTC GenKiMerriMix PunctFi"/>
+        </w:rPr>
+        <w:t xml:space="preserve">\ </w:t>
+      </w:r>
+      <w:proofErr w:type="gramStart"/>
+      <w:r>
+        <w:rPr>
+          <w:rFonts w:ascii="KlarMinTC GenKiMerriMix PunctFi" w:eastAsia="KlarMinTC GenKiMerriMix PunctFi" w:hAnsi="KlarMinTC GenKiMerriMix PunctFi"/>
+        </w:rPr>
+        <w:t>＼</w:t>
+      </w:r>
+      <w:proofErr w:type="gramEnd"/>
+    </w:p>
+    <w:p>
+      <w:pPr>
+        <w:spacing w:after="0" w:line="0" w:lineRule="atLeast"/>
+        <w:rPr>
+          <w:rFonts w:ascii="KlarMinTC GenKiMerriMix PunctFi" w:eastAsia="KlarMinTC GenKiMerriMix PunctFi" w:hAnsi="KlarMinTC GenKiMerriMix PunctFi"/>
+        </w:rPr>
+      </w:pPr>
+      <w:r>
+        <w:rPr>
+          <w:rFonts w:ascii="KlarMinTC GenKiMerriMix PunctFi" w:eastAsia="KlarMinTC GenKiMerriMix PunctFi" w:hAnsi="KlarMinTC GenKiMerriMix PunctFi"/>
+        </w:rPr>
+        <w:t xml:space="preserve">| </w:t>
+      </w:r>
+      <w:proofErr w:type="gramStart"/>
+      <w:r>
+        <w:rPr>
+          <w:rFonts w:ascii="KlarMinTC GenKiMerriMix PunctFi" w:eastAsia="KlarMinTC GenKiMerriMix PunctFi" w:hAnsi="KlarMinTC GenKiMerriMix PunctFi"/>
+        </w:rPr>
+        <w:t>｜</w:t>
+      </w:r>
+      <w:proofErr w:type="gramEnd"/>
+    </w:p>
+    <w:p>
+      <w:pPr>
+        <w:spacing w:after="0" w:line="0" w:lineRule="atLeast"/>
+        <w:rPr>
+          <w:rFonts w:ascii="KlarMinTC GenKiMerriMix PunctFi" w:eastAsia="KlarMinTC GenKiMerriMix PunctFi" w:hAnsi="KlarMinTC GenKiMerriMix PunctFi"/>
+        </w:rPr>
+      </w:pPr>
+      <w:r>
+        <w:rPr>
+          <w:rFonts w:ascii="KlarMinTC GenKiMerriMix PunctFi" w:eastAsia="KlarMinTC GenKiMerriMix PunctFi" w:hAnsi="KlarMinTC GenKiMerriMix PunctFi"/>
+        </w:rPr>
         <w:lastRenderedPageBreak/>
-        <w:t>‹</w:t>
-      </w:r>
-      <w:r>
-        <w:rPr>
-          <w:rFonts w:ascii="KlarMinTC GenKiMerriMix PunctFi" w:eastAsia="KlarMinTC GenKiMerriMix PunctFi" w:hAnsi="KlarMinTC GenKiMerriMix PunctFi"/>
-        </w:rPr>
-        <w:t>angle</w:t>
-      </w:r>
-      <w:r>
-        <w:rPr>
-          <w:rFonts w:ascii="Times New Roman" w:eastAsia="KlarMinTC GenKiMerriMix PunctFi" w:hAnsi="Times New Roman" w:cs="Times New Roman"/>
-        </w:rPr>
-        <w:t>‹</w:t>
-      </w:r>
-      <w:r>
-        <w:rPr>
-          <w:rFonts w:ascii="KlarMinTC GenKiMerriMix PunctFi" w:eastAsia="KlarMinTC GenKiMerriMix PunctFi" w:hAnsi="KlarMinTC GenKiMerriMix PunctFi"/>
-        </w:rPr>
-        <w:t xml:space="preserve"> </w:t>
-      </w:r>
-      <w:r>
-        <w:rPr>
-          <w:rFonts w:ascii="Times New Roman" w:eastAsia="KlarMinTC GenKiMerriMix PunctFi" w:hAnsi="Times New Roman" w:cs="Times New Roman"/>
-        </w:rPr>
-        <w:t>›</w:t>
-      </w:r>
-      <w:r>
-        <w:rPr>
-          <w:rFonts w:ascii="KlarMinTC GenKiMerriMix PunctFi" w:eastAsia="KlarMinTC GenKiMerriMix PunctFi" w:hAnsi="KlarMinTC GenKiMerriMix PunctFi"/>
-        </w:rPr>
-        <w:t>angle</w:t>
-      </w:r>
-      <w:r>
-        <w:rPr>
-          <w:rFonts w:ascii="Times New Roman" w:eastAsia="KlarMinTC GenKiMerriMix PunctFi" w:hAnsi="Times New Roman" w:cs="Times New Roman"/>
-        </w:rPr>
-        <w:t>›</w:t>
-      </w:r>
-    </w:p>
-    <w:p>
-      <w:pPr>
-        <w:spacing w:after="0" w:line="0" w:lineRule="atLeast"/>
-        <w:rPr>
-          <w:rFonts w:ascii="KlarMinTC GenKiMerriMix PunctFi" w:eastAsia="KlarMinTC GenKiMerriMix PunctFi" w:hAnsi="KlarMinTC GenKiMerriMix PunctFi"/>
-        </w:rPr>
-      </w:pPr>
-      <w:r>
-        <w:rPr>
-          <w:rFonts w:ascii="KlarMinTC GenKiMerriMix PunctFi" w:eastAsia="KlarMinTC GenKiMerriMix PunctFi" w:hAnsi="KlarMinTC GenKiMerriMix PunctFi"/>
-        </w:rPr>
-        <w:t>prime: 5′ 10</w:t>
-      </w:r>
-      <w:r>
-        <w:rPr>
-          <w:rFonts w:ascii="Times New Roman" w:eastAsia="KlarMinTC GenKiMerriMix PunctFi" w:hAnsi="Times New Roman" w:cs="Times New Roman"/>
-        </w:rPr>
-        <w:t>″</w:t>
-      </w:r>
-    </w:p>
-    <w:p>
-      <w:pPr>
-        <w:spacing w:after="0" w:line="0" w:lineRule="atLeast"/>
-        <w:rPr>
-          <w:rFonts w:ascii="KlarMinTC GenKiMerriMix PunctFi" w:eastAsia="KlarMinTC GenKiMerriMix PunctFi" w:hAnsi="KlarMinTC GenKiMerriMix PunctFi"/>
-        </w:rPr>
-      </w:pPr>
-      <w:r>
-        <w:rPr>
-          <w:rFonts w:ascii="KlarMinTC GenKiMerriMix PunctFi" w:eastAsia="KlarMinTC GenKiMerriMix PunctFi" w:hAnsi="KlarMinTC GenKiMerriMix PunctFi"/>
-        </w:rPr>
-        <w:t xml:space="preserve">warning: </w:t>
-      </w:r>
-      <w:r>
-        <w:rPr>
-          <w:rFonts w:ascii="Times New Roman" w:eastAsia="KlarMinTC GenKiMerriMix PunctFi" w:hAnsi="Times New Roman" w:cs="Times New Roman"/>
-        </w:rPr>
-        <w:t>‼</w:t>
-      </w:r>
-    </w:p>
-    <w:p>
-      <w:pPr>
-        <w:spacing w:after="0" w:line="0" w:lineRule="atLeast"/>
-        <w:rPr>
-          <w:rFonts w:ascii="KlarMinTC GenKiMerriMix PunctFi" w:eastAsia="KlarMinTC GenKiMerriMix PunctFi" w:hAnsi="KlarMinTC GenKiMerriMix PunctFi"/>
-        </w:rPr>
-      </w:pPr>
-      <w:r>
-        <w:rPr>
-          <w:rFonts w:ascii="KlarMinTC GenKiMerriMix PunctFi" w:eastAsia="KlarMinTC GenKiMerriMix PunctFi" w:hAnsi="KlarMinTC GenKiMerriMix PunctFi"/>
-        </w:rPr>
-        <w:t xml:space="preserve">quote test: ‘A’, “B”, </w:t>
-      </w:r>
-      <w:r>
-        <w:rPr>
-          <w:rFonts w:ascii="Times New Roman" w:eastAsia="KlarMinTC GenKiMerriMix PunctFi" w:hAnsi="Times New Roman" w:cs="Times New Roman"/>
-        </w:rPr>
-        <w:t>‚</w:t>
-      </w:r>
-      <w:r>
-        <w:rPr>
-          <w:rFonts w:ascii="KlarMinTC GenKiMerriMix PunctFi" w:eastAsia="KlarMinTC GenKiMerriMix PunctFi" w:hAnsi="KlarMinTC GenKiMerriMix PunctFi"/>
-        </w:rPr>
-        <w:t>C</w:t>
-      </w:r>
-      <w:r>
-        <w:rPr>
-          <w:rFonts w:ascii="KlarMinTC GenKiMerriMix PunctFi" w:eastAsia="KlarMinTC GenKiMerriMix PunctFi" w:hAnsi="KlarMinTC GenKiMerriMix PunctFi" w:cs="KlarMinTC GenKiMerriMix PunctFi" w:hint="eastAsia"/>
-        </w:rPr>
-        <w:t>’</w:t>
-      </w:r>
-      <w:r>
-        <w:rPr>
-          <w:rFonts w:ascii="KlarMinTC GenKiMerriMix PunctFi" w:eastAsia="KlarMinTC GenKiMerriMix PunctFi" w:hAnsi="KlarMinTC GenKiMerriMix PunctFi"/>
-        </w:rPr>
-        <w:t xml:space="preserve">, </w:t>
-      </w:r>
-      <w:r>
-        <w:rPr>
-          <w:rFonts w:ascii="Times New Roman" w:eastAsia="KlarMinTC GenKiMerriMix PunctFi" w:hAnsi="Times New Roman" w:cs="Times New Roman"/>
-        </w:rPr>
-        <w:t>„</w:t>
-      </w:r>
-      <w:r>
-        <w:rPr>
-          <w:rFonts w:ascii="KlarMinTC GenKiMerriMix PunctFi" w:eastAsia="KlarMinTC GenKiMerriMix PunctFi" w:hAnsi="KlarMinTC GenKiMerriMix PunctFi"/>
-        </w:rPr>
-        <w:t>D</w:t>
-      </w:r>
-      <w:r>
-        <w:rPr>
-          <w:rFonts w:ascii="KlarMinTC GenKiMerriMix PunctFi" w:eastAsia="KlarMinTC GenKiMerriMix PunctFi" w:hAnsi="KlarMinTC GenKiMerriMix PunctFi" w:cs="KlarMinTC GenKiMerriMix PunctFi" w:hint="eastAsia"/>
-        </w:rPr>
-        <w:t>”</w:t>
-      </w:r>
-      <w:r>
-        <w:rPr>
-          <w:rFonts w:ascii="KlarMinTC GenKiMerriMix PunctFi" w:eastAsia="KlarMinTC GenKiMerriMix PunctFi" w:hAnsi="KlarMinTC GenKiMerriMix PunctFi"/>
-        </w:rPr>
-        <w:t xml:space="preserve">, </w:t>
-      </w:r>
-      <w:r>
-        <w:rPr>
-          <w:rFonts w:ascii="Times New Roman" w:eastAsia="KlarMinTC GenKiMerriMix PunctFi" w:hAnsi="Times New Roman" w:cs="Times New Roman"/>
-        </w:rPr>
-        <w:t>‹</w:t>
-      </w:r>
-      <w:r>
-        <w:rPr>
-          <w:rFonts w:ascii="KlarMinTC GenKiMerriMix PunctFi" w:eastAsia="KlarMinTC GenKiMerriMix PunctFi" w:hAnsi="KlarMinTC GenKiMerriMix PunctFi"/>
-        </w:rPr>
-        <w:t>E</w:t>
-      </w:r>
-      <w:r>
-        <w:rPr>
-          <w:rFonts w:ascii="Times New Roman" w:eastAsia="KlarMinTC GenKiMerriMix PunctFi" w:hAnsi="Times New Roman" w:cs="Times New Roman"/>
-        </w:rPr>
-        <w:t>›</w:t>
-      </w:r>
-    </w:p>
-    <w:p>
-      <w:pPr>
-        <w:spacing w:after="0" w:line="0" w:lineRule="atLeast"/>
-        <w:rPr>
-          <w:rFonts w:ascii="KlarMinTC GenKiMerriMix PunctFi" w:eastAsia="KlarMinTC GenKiMerriMix PunctFi" w:hAnsi="KlarMinTC GenKiMerriMix PunctFi"/>
-        </w:rPr>
-      </w:pPr>
-    </w:p>
-    <w:p>
-      <w:pPr>
-        <w:spacing w:after="0" w:line="0" w:lineRule="atLeast"/>
-        <w:rPr>
-          <w:rFonts w:ascii="KlarMinTC GenKiMerriMix PunctFi" w:eastAsia="KlarMinTC GenKiMerriMix PunctFi" w:hAnsi="KlarMinTC GenKiMerriMix PunctFi"/>
-        </w:rPr>
-      </w:pPr>
-      <w:r>
-        <w:rPr>
-          <w:rFonts w:ascii="KlarMinTC GenKiMerriMix PunctFi" w:eastAsia="KlarMinTC GenKiMerriMix PunctFi" w:hAnsi="KlarMinTC GenKiMerriMix PunctFi"/>
-        </w:rPr>
-        <w:t>全形常用標點：</w:t>
-      </w:r>
-    </w:p>
-    <w:p>
-      <w:pPr>
-        <w:spacing w:after="0" w:line="0" w:lineRule="atLeast"/>
-        <w:rPr>
-          <w:rFonts w:ascii="KlarMinTC GenKiMerriMix PunctFi" w:eastAsia="KlarMinTC GenKiMerriMix PunctFi" w:hAnsi="KlarMinTC GenKiMerriMix PunctFi"/>
-        </w:rPr>
-      </w:pPr>
-      <w:r>
-        <w:rPr>
-          <w:rFonts w:ascii="KlarMinTC GenKiMerriMix PunctFi" w:eastAsia="KlarMinTC GenKiMerriMix PunctFi" w:hAnsi="KlarMinTC GenKiMerriMix PunctFi"/>
-        </w:rPr>
-        <w:t xml:space="preserve">， 。 、 ； ： ！ ？ （ ） 【 】 〔 〕 「 」 『 』 《 》 〈 〉 ／ </w:t>
+        <w:t>~ ～</w:t>
+      </w:r>
+    </w:p>
+    <w:p>
+      <w:pPr>
+        <w:spacing w:after="0" w:line="0" w:lineRule="atLeast"/>
+        <w:rPr>
+          <w:rFonts w:ascii="KlarMinTC GenKiMerriMix PunctFi" w:eastAsia="KlarMinTC GenKiMerriMix PunctFi" w:hAnsi="KlarMinTC GenKiMerriMix PunctFi"/>
+        </w:rPr>
+      </w:pPr>
+      <w:r>
+        <w:rPr>
+          <w:rFonts w:ascii="KlarMinTC GenKiMerriMix PunctFi" w:eastAsia="KlarMinTC GenKiMerriMix PunctFi" w:hAnsi="KlarMinTC GenKiMerriMix PunctFi"/>
+        </w:rPr>
+        <w:t xml:space="preserve">` </w:t>
       </w:r>
       <w:proofErr w:type="gramStart"/>
       <w:r>
         <w:rPr>
-          <w:rFonts w:ascii="KlarMinTC GenKiMerriMix PunctFi" w:eastAsia="KlarMinTC GenKiMerriMix PunctFi" w:hAnsi="KlarMinTC GenKiMerriMix PunctFi"/>
-        </w:rPr>
-        <w:t>＼</w:t>
+          <w:rFonts w:ascii="新細明體" w:eastAsia="新細明體" w:hAnsi="新細明體" w:cs="新細明體" w:hint="eastAsia"/>
+        </w:rPr>
+        <w:t>｀</w:t>
       </w:r>
       <w:proofErr w:type="gramEnd"/>
-      <w:r>
-        <w:rPr>
-          <w:rFonts w:ascii="KlarMinTC GenKiMerriMix PunctFi" w:eastAsia="KlarMinTC GenKiMerriMix PunctFi" w:hAnsi="KlarMinTC GenKiMerriMix PunctFi"/>
-        </w:rPr>
-        <w:t xml:space="preserve"> </w:t>
+    </w:p>
+    <w:p>
+      <w:pPr>
+        <w:spacing w:after="0" w:line="0" w:lineRule="atLeast"/>
+        <w:rPr>
+          <w:rFonts w:ascii="KlarMinTC GenKiMerriMix PunctFi" w:eastAsia="KlarMinTC GenKiMerriMix PunctFi" w:hAnsi="KlarMinTC GenKiMerriMix PunctFi"/>
+        </w:rPr>
+      </w:pPr>
+      <w:r>
+        <w:rPr>
+          <w:rFonts w:ascii="KlarMinTC GenKiMerriMix PunctFi" w:eastAsia="KlarMinTC GenKiMerriMix PunctFi" w:hAnsi="KlarMinTC GenKiMerriMix PunctFi"/>
+        </w:rPr>
+        <w:t xml:space="preserve">&lt; </w:t>
       </w:r>
       <w:proofErr w:type="gramStart"/>
       <w:r>
         <w:rPr>
           <w:rFonts w:ascii="KlarMinTC GenKiMerriMix PunctFi" w:eastAsia="KlarMinTC GenKiMerriMix PunctFi" w:hAnsi="KlarMinTC GenKiMerriMix PunctFi"/>
         </w:rPr>
-        <w:t>｜</w:t>
+        <w:t>〈</w:t>
       </w:r>
       <w:proofErr w:type="gramEnd"/>
-      <w:r>
-        <w:rPr>
-          <w:rFonts w:ascii="KlarMinTC GenKiMerriMix PunctFi" w:eastAsia="KlarMinTC GenKiMerriMix PunctFi" w:hAnsi="KlarMinTC GenKiMerriMix PunctFi"/>
-        </w:rPr>
-        <w:t xml:space="preserve"> ～ </w:t>
+    </w:p>
+    <w:p>
+      <w:pPr>
+        <w:spacing w:after="0" w:line="0" w:lineRule="atLeast"/>
+        <w:rPr>
+          <w:rFonts w:ascii="KlarMinTC GenKiMerriMix PunctFi" w:eastAsia="KlarMinTC GenKiMerriMix PunctFi" w:hAnsi="KlarMinTC GenKiMerriMix PunctFi"/>
+        </w:rPr>
+      </w:pPr>
+      <w:r>
+        <w:rPr>
+          <w:rFonts w:ascii="KlarMinTC GenKiMerriMix PunctFi" w:eastAsia="KlarMinTC GenKiMerriMix PunctFi" w:hAnsi="KlarMinTC GenKiMerriMix PunctFi"/>
+        </w:rPr>
+        <w:t xml:space="preserve">&gt; </w:t>
       </w:r>
       <w:proofErr w:type="gramStart"/>
       <w:r>
         <w:rPr>
-          <w:rFonts w:ascii="新細明體" w:eastAsia="新細明體" w:hAnsi="新細明體" w:cs="新細明體" w:hint="eastAsia"/>
-        </w:rPr>
-        <w:t>｀</w:t>
+          <w:rFonts w:ascii="KlarMinTC GenKiMerriMix PunctFi" w:eastAsia="KlarMinTC GenKiMerriMix PunctFi" w:hAnsi="KlarMinTC GenKiMerriMix PunctFi"/>
+        </w:rPr>
+        <w:t>〉</w:t>
       </w:r>
       <w:proofErr w:type="gramEnd"/>
-      <w:r>
-        <w:rPr>
-          <w:rFonts w:ascii="KlarMinTC GenKiMerriMix PunctFi" w:eastAsia="KlarMinTC GenKiMerriMix PunctFi" w:hAnsi="KlarMinTC GenKiMerriMix PunctFi"/>
-        </w:rPr>
-        <w:t xml:space="preserve"> ．</w:t>
-      </w:r>
-    </w:p>
-    <w:p>
-      <w:pPr>
-        <w:spacing w:after="0" w:line="0" w:lineRule="atLeast"/>
-        <w:rPr>
-          <w:rFonts w:ascii="KlarMinTC GenKiMerriMix PunctFi" w:eastAsia="KlarMinTC GenKiMerriMix PunctFi" w:hAnsi="KlarMinTC GenKiMerriMix PunctFi"/>
-        </w:rPr>
-      </w:pPr>
-      <w:r>
-        <w:rPr>
-          <w:rFonts w:ascii="KlarMinTC GenKiMerriMix PunctFi" w:eastAsia="KlarMinTC GenKiMerriMix PunctFi" w:hAnsi="KlarMinTC GenKiMerriMix PunctFi"/>
-        </w:rPr>
-        <w:t>中文「引號」與『雙層引號』，還有（圓括號）、【方頭括號】、〈尖括號〉、《書名號》都要看起來穩定。</w:t>
-      </w:r>
-    </w:p>
-    <w:p>
-      <w:pPr>
-        <w:spacing w:after="0" w:line="0" w:lineRule="atLeast"/>
-        <w:rPr>
-          <w:rFonts w:ascii="KlarMinTC GenKiMerriMix PunctFi" w:eastAsia="KlarMinTC GenKiMerriMix PunctFi" w:hAnsi="KlarMinTC GenKiMerriMix PunctFi"/>
-        </w:rPr>
-      </w:pPr>
-    </w:p>
-    <w:p>
-      <w:pPr>
-        <w:spacing w:after="0" w:line="0" w:lineRule="atLeast"/>
-        <w:rPr>
-          <w:rFonts w:ascii="KlarMinTC GenKiMerriMix PunctFi" w:eastAsia="KlarMinTC GenKiMerriMix PunctFi" w:hAnsi="KlarMinTC GenKiMerriMix PunctFi"/>
-        </w:rPr>
-      </w:pPr>
-      <w:r>
-        <w:rPr>
-          <w:rFonts w:ascii="KlarMinTC GenKiMerriMix PunctFi" w:eastAsia="KlarMinTC GenKiMerriMix PunctFi" w:hAnsi="KlarMinTC GenKiMerriMix PunctFi"/>
-        </w:rPr>
-        <w:t>全半形對照：</w:t>
-      </w:r>
-    </w:p>
-    <w:p>
-      <w:pPr>
-        <w:spacing w:after="0" w:line="0" w:lineRule="atLeast"/>
-        <w:rPr>
-          <w:rFonts w:ascii="KlarMinTC GenKiMerriMix PunctFi" w:eastAsia="KlarMinTC GenKiMerriMix PunctFi" w:hAnsi="KlarMinTC GenKiMerriMix PunctFi"/>
-        </w:rPr>
-      </w:pPr>
-      <w:r>
-        <w:rPr>
-          <w:rFonts w:ascii="KlarMinTC GenKiMerriMix PunctFi" w:eastAsia="KlarMinTC GenKiMerriMix PunctFi" w:hAnsi="KlarMinTC GenKiMerriMix PunctFi"/>
-        </w:rPr>
-        <w:t>, ，</w:t>
-      </w:r>
-    </w:p>
-    <w:p>
-      <w:pPr>
-        <w:spacing w:after="0" w:line="0" w:lineRule="atLeast"/>
-        <w:rPr>
-          <w:rFonts w:ascii="KlarMinTC GenKiMerriMix PunctFi" w:eastAsia="KlarMinTC GenKiMerriMix PunctFi" w:hAnsi="KlarMinTC GenKiMerriMix PunctFi"/>
-        </w:rPr>
-      </w:pPr>
-      <w:r>
-        <w:rPr>
-          <w:rFonts w:ascii="KlarMinTC GenKiMerriMix PunctFi" w:eastAsia="KlarMinTC GenKiMerriMix PunctFi" w:hAnsi="KlarMinTC GenKiMerriMix PunctFi"/>
-        </w:rPr>
-        <w:t>. 。</w:t>
-      </w:r>
-    </w:p>
-    <w:p>
-      <w:pPr>
-        <w:spacing w:after="0" w:line="0" w:lineRule="atLeast"/>
-        <w:rPr>
-          <w:rFonts w:ascii="KlarMinTC GenKiMerriMix PunctFi" w:eastAsia="KlarMinTC GenKiMerriMix PunctFi" w:hAnsi="KlarMinTC GenKiMerriMix PunctFi"/>
-        </w:rPr>
-      </w:pPr>
-      <w:r>
-        <w:rPr>
-          <w:rFonts w:ascii="KlarMinTC GenKiMerriMix PunctFi" w:eastAsia="KlarMinTC GenKiMerriMix PunctFi" w:hAnsi="KlarMinTC GenKiMerriMix PunctFi"/>
-        </w:rPr>
-        <w:t>: ：</w:t>
-      </w:r>
-    </w:p>
-    <w:p>
-      <w:pPr>
-        <w:spacing w:after="0" w:line="0" w:lineRule="atLeast"/>
-        <w:rPr>
-          <w:rFonts w:ascii="KlarMinTC GenKiMerriMix PunctFi" w:eastAsia="KlarMinTC GenKiMerriMix PunctFi" w:hAnsi="KlarMinTC GenKiMerriMix PunctFi"/>
-        </w:rPr>
-      </w:pPr>
-      <w:r>
-        <w:rPr>
-          <w:rFonts w:ascii="KlarMinTC GenKiMerriMix PunctFi" w:eastAsia="KlarMinTC GenKiMerriMix PunctFi" w:hAnsi="KlarMinTC GenKiMerriMix PunctFi"/>
-        </w:rPr>
-        <w:t>; ；</w:t>
-      </w:r>
-    </w:p>
-    <w:p>
-      <w:pPr>
-        <w:spacing w:after="0" w:line="0" w:lineRule="atLeast"/>
-        <w:rPr>
-          <w:rFonts w:ascii="KlarMinTC GenKiMerriMix PunctFi" w:eastAsia="KlarMinTC GenKiMerriMix PunctFi" w:hAnsi="KlarMinTC GenKiMerriMix PunctFi"/>
-        </w:rPr>
-      </w:pPr>
-      <w:r>
-        <w:rPr>
-          <w:rFonts w:ascii="KlarMinTC GenKiMerriMix PunctFi" w:eastAsia="KlarMinTC GenKiMerriMix PunctFi" w:hAnsi="KlarMinTC GenKiMerriMix PunctFi"/>
-        </w:rPr>
-        <w:t>! ！</w:t>
-      </w:r>
-    </w:p>
-    <w:p>
-      <w:pPr>
-        <w:spacing w:after="0" w:line="0" w:lineRule="atLeast"/>
-        <w:rPr>
-          <w:rFonts w:ascii="KlarMinTC GenKiMerriMix PunctFi" w:eastAsia="KlarMinTC GenKiMerriMix PunctFi" w:hAnsi="KlarMinTC GenKiMerriMix PunctFi"/>
-        </w:rPr>
-      </w:pPr>
-      <w:r>
-        <w:rPr>
-          <w:rFonts w:ascii="KlarMinTC GenKiMerriMix PunctFi" w:eastAsia="KlarMinTC GenKiMerriMix PunctFi" w:hAnsi="KlarMinTC GenKiMerriMix PunctFi"/>
-        </w:rPr>
-        <w:t>? ？</w:t>
-      </w:r>
-    </w:p>
-    <w:p>
-      <w:pPr>
-        <w:spacing w:after="0" w:line="0" w:lineRule="atLeast"/>
-        <w:rPr>
-          <w:rFonts w:ascii="KlarMinTC GenKiMerriMix PunctFi" w:eastAsia="KlarMinTC GenKiMerriMix PunctFi" w:hAnsi="KlarMinTC GenKiMerriMix PunctFi"/>
-        </w:rPr>
-      </w:pPr>
-      <w:r>
-        <w:rPr>
-          <w:rFonts w:ascii="KlarMinTC GenKiMerriMix PunctFi" w:eastAsia="KlarMinTC GenKiMerriMix PunctFi" w:hAnsi="KlarMinTC GenKiMerriMix PunctFi"/>
-        </w:rPr>
-        <w:t xml:space="preserve">( </w:t>
-      </w:r>
-      <w:proofErr w:type="gramStart"/>
-      <w:r>
-        <w:rPr>
-          <w:rFonts w:ascii="KlarMinTC GenKiMerriMix PunctFi" w:eastAsia="KlarMinTC GenKiMerriMix PunctFi" w:hAnsi="KlarMinTC GenKiMerriMix PunctFi"/>
-        </w:rPr>
-        <w:t>（</w:t>
-      </w:r>
-      <w:proofErr w:type="gramEnd"/>
-    </w:p>
-    <w:p>
-      <w:pPr>
-        <w:spacing w:after="0" w:line="0" w:lineRule="atLeast"/>
-        <w:rPr>
-          <w:rFonts w:ascii="KlarMinTC GenKiMerriMix PunctFi" w:eastAsia="KlarMinTC GenKiMerriMix PunctFi" w:hAnsi="KlarMinTC GenKiMerriMix PunctFi"/>
-        </w:rPr>
-      </w:pPr>
-      <w:r>
-        <w:rPr>
-          <w:rFonts w:ascii="KlarMinTC GenKiMerriMix PunctFi" w:eastAsia="KlarMinTC GenKiMerriMix PunctFi" w:hAnsi="KlarMinTC GenKiMerriMix PunctFi"/>
-        </w:rPr>
-        <w:t xml:space="preserve">) </w:t>
-      </w:r>
-      <w:proofErr w:type="gramStart"/>
-      <w:r>
-        <w:rPr>
-          <w:rFonts w:ascii="KlarMinTC GenKiMerriMix PunctFi" w:eastAsia="KlarMinTC GenKiMerriMix PunctFi" w:hAnsi="KlarMinTC GenKiMerriMix PunctFi"/>
-        </w:rPr>
-        <w:t>）</w:t>
-      </w:r>
-      <w:proofErr w:type="gramEnd"/>
-    </w:p>
-    <w:p>
-      <w:pPr>
-        <w:spacing w:after="0" w:line="0" w:lineRule="atLeast"/>
-        <w:rPr>
-          <w:rFonts w:ascii="KlarMinTC GenKiMerriMix PunctFi" w:eastAsia="KlarMinTC GenKiMerriMix PunctFi" w:hAnsi="KlarMinTC GenKiMerriMix PunctFi"/>
-        </w:rPr>
-      </w:pPr>
-      <w:r>
-        <w:rPr>
-          <w:rFonts w:ascii="KlarMinTC GenKiMerriMix PunctFi" w:eastAsia="KlarMinTC GenKiMerriMix PunctFi" w:hAnsi="KlarMinTC GenKiMerriMix PunctFi"/>
-        </w:rPr>
-        <w:t xml:space="preserve">[ </w:t>
-      </w:r>
-      <w:proofErr w:type="gramStart"/>
-      <w:r>
-        <w:rPr>
-          <w:rFonts w:ascii="KlarMinTC GenKiMerriMix PunctFi" w:eastAsia="KlarMinTC GenKiMerriMix PunctFi" w:hAnsi="KlarMinTC GenKiMerriMix PunctFi"/>
-        </w:rPr>
-        <w:t>【</w:t>
-      </w:r>
-      <w:proofErr w:type="gramEnd"/>
-    </w:p>
-    <w:p>
-      <w:pPr>
-        <w:spacing w:after="0" w:line="0" w:lineRule="atLeast"/>
-        <w:rPr>
-          <w:rFonts w:ascii="KlarMinTC GenKiMerriMix PunctFi" w:eastAsia="KlarMinTC GenKiMerriMix PunctFi" w:hAnsi="KlarMinTC GenKiMerriMix PunctFi"/>
-        </w:rPr>
-      </w:pPr>
-      <w:r>
-        <w:rPr>
-          <w:rFonts w:ascii="KlarMinTC GenKiMerriMix PunctFi" w:eastAsia="KlarMinTC GenKiMerriMix PunctFi" w:hAnsi="KlarMinTC GenKiMerriMix PunctFi"/>
-        </w:rPr>
-        <w:t xml:space="preserve">] </w:t>
-      </w:r>
-      <w:proofErr w:type="gramStart"/>
-      <w:r>
-        <w:rPr>
-          <w:rFonts w:ascii="KlarMinTC GenKiMerriMix PunctFi" w:eastAsia="KlarMinTC GenKiMerriMix PunctFi" w:hAnsi="KlarMinTC GenKiMerriMix PunctFi"/>
-        </w:rPr>
-        <w:t>】</w:t>
-      </w:r>
-      <w:proofErr w:type="gramEnd"/>
-    </w:p>
-    <w:p>
-      <w:pPr>
-        <w:spacing w:after="0" w:line="0" w:lineRule="atLeast"/>
-        <w:rPr>
-          <w:rFonts w:ascii="KlarMinTC GenKiMerriMix PunctFi" w:eastAsia="KlarMinTC GenKiMerriMix PunctFi" w:hAnsi="KlarMinTC GenKiMerriMix PunctFi"/>
-        </w:rPr>
-      </w:pPr>
-      <w:r>
-        <w:rPr>
-          <w:rFonts w:ascii="KlarMinTC GenKiMerriMix PunctFi" w:eastAsia="KlarMinTC GenKiMerriMix PunctFi" w:hAnsi="KlarMinTC GenKiMerriMix PunctFi"/>
-        </w:rPr>
-        <w:t xml:space="preserve">{ </w:t>
-      </w:r>
-      <w:proofErr w:type="gramStart"/>
-      <w:r>
-        <w:rPr>
-          <w:rFonts w:ascii="KlarMinTC GenKiMerriMix PunctFi" w:eastAsia="KlarMinTC GenKiMerriMix PunctFi" w:hAnsi="KlarMinTC GenKiMerriMix PunctFi"/>
-        </w:rPr>
-        <w:t>〔</w:t>
-      </w:r>
-      <w:proofErr w:type="gramEnd"/>
-    </w:p>
-    <w:p>
-      <w:pPr>
-        <w:spacing w:after="0" w:line="0" w:lineRule="atLeast"/>
-        <w:rPr>
-          <w:rFonts w:ascii="KlarMinTC GenKiMerriMix PunctFi" w:eastAsia="KlarMinTC GenKiMerriMix PunctFi" w:hAnsi="KlarMinTC GenKiMerriMix PunctFi"/>
-        </w:rPr>
-      </w:pPr>
-      <w:r>
-        <w:rPr>
-          <w:rFonts w:ascii="KlarMinTC GenKiMerriMix PunctFi" w:eastAsia="KlarMinTC GenKiMerriMix PunctFi" w:hAnsi="KlarMinTC GenKiMerriMix PunctFi"/>
-        </w:rPr>
-        <w:t xml:space="preserve">} </w:t>
-      </w:r>
-      <w:proofErr w:type="gramStart"/>
-      <w:r>
-        <w:rPr>
-          <w:rFonts w:ascii="KlarMinTC GenKiMerriMix PunctFi" w:eastAsia="KlarMinTC GenKiMerriMix PunctFi" w:hAnsi="KlarMinTC GenKiMerriMix PunctFi"/>
-        </w:rPr>
-        <w:t>〕</w:t>
-      </w:r>
-      <w:proofErr w:type="gramEnd"/>
-    </w:p>
-    <w:p>
-      <w:pPr>
-        <w:spacing w:after="0" w:line="0" w:lineRule="atLeast"/>
-        <w:rPr>
-          <w:rFonts w:ascii="KlarMinTC GenKiMerriMix PunctFi" w:eastAsia="KlarMinTC GenKiMerriMix PunctFi" w:hAnsi="KlarMinTC GenKiMerriMix PunctFi"/>
-        </w:rPr>
-      </w:pPr>
-      <w:r>
-        <w:rPr>
-          <w:rFonts w:ascii="KlarMinTC GenKiMerriMix PunctFi" w:eastAsia="KlarMinTC GenKiMerriMix PunctFi" w:hAnsi="KlarMinTC GenKiMerriMix PunctFi"/>
-        </w:rPr>
-        <w:t>/ ／</w:t>
-      </w:r>
-    </w:p>
-    <w:p>
-      <w:pPr>
-        <w:spacing w:after="0" w:line="0" w:lineRule="atLeast"/>
-        <w:rPr>
-          <w:rFonts w:ascii="KlarMinTC GenKiMerriMix PunctFi" w:eastAsia="KlarMinTC GenKiMerriMix PunctFi" w:hAnsi="KlarMinTC GenKiMerriMix PunctFi"/>
-        </w:rPr>
-      </w:pPr>
-      <w:r>
-        <w:rPr>
-          <w:rFonts w:ascii="KlarMinTC GenKiMerriMix PunctFi" w:eastAsia="KlarMinTC GenKiMerriMix PunctFi" w:hAnsi="KlarMinTC GenKiMerriMix PunctFi"/>
-        </w:rPr>
-        <w:t xml:space="preserve">\ </w:t>
-      </w:r>
-      <w:proofErr w:type="gramStart"/>
-      <w:r>
-        <w:rPr>
-          <w:rFonts w:ascii="KlarMinTC GenKiMerriMix PunctFi" w:eastAsia="KlarMinTC GenKiMerriMix PunctFi" w:hAnsi="KlarMinTC GenKiMerriMix PunctFi"/>
-        </w:rPr>
-        <w:t>＼</w:t>
-      </w:r>
-      <w:proofErr w:type="gramEnd"/>
-    </w:p>
-    <w:p>
-      <w:pPr>
-        <w:spacing w:after="0" w:line="0" w:lineRule="atLeast"/>
-        <w:rPr>
-          <w:rFonts w:ascii="KlarMinTC GenKiMerriMix PunctFi" w:eastAsia="KlarMinTC GenKiMerriMix PunctFi" w:hAnsi="KlarMinTC GenKiMerriMix PunctFi"/>
-        </w:rPr>
-      </w:pPr>
-      <w:r>
-        <w:rPr>
-          <w:rFonts w:ascii="KlarMinTC GenKiMerriMix PunctFi" w:eastAsia="KlarMinTC GenKiMerriMix PunctFi" w:hAnsi="KlarMinTC GenKiMerriMix PunctFi"/>
-        </w:rPr>
-        <w:t xml:space="preserve">| </w:t>
-      </w:r>
-      <w:proofErr w:type="gramStart"/>
-      <w:r>
-        <w:rPr>
-          <w:rFonts w:ascii="KlarMinTC GenKiMerriMix PunctFi" w:eastAsia="KlarMinTC GenKiMerriMix PunctFi" w:hAnsi="KlarMinTC GenKiMerriMix PunctFi"/>
-        </w:rPr>
-        <w:t>｜</w:t>
-      </w:r>
-      <w:proofErr w:type="gramEnd"/>
-    </w:p>
-    <w:p>
-      <w:pPr>
-        <w:spacing w:after="0" w:line="0" w:lineRule="atLeast"/>
-        <w:rPr>
-          <w:rFonts w:ascii="KlarMinTC GenKiMerriMix PunctFi" w:eastAsia="KlarMinTC GenKiMerriMix PunctFi" w:hAnsi="KlarMinTC GenKiMerriMix PunctFi"/>
-        </w:rPr>
-      </w:pPr>
-      <w:r>
-        <w:rPr>
-          <w:rFonts w:ascii="KlarMinTC GenKiMerriMix PunctFi" w:eastAsia="KlarMinTC GenKiMerriMix PunctFi" w:hAnsi="KlarMinTC GenKiMerriMix PunctFi"/>
-        </w:rPr>
-        <w:t>~ ～</w:t>
-      </w:r>
-    </w:p>
-    <w:p>
-      <w:pPr>
-        <w:spacing w:after="0" w:line="0" w:lineRule="atLeast"/>
-        <w:rPr>
-          <w:rFonts w:ascii="KlarMinTC GenKiMerriMix PunctFi" w:eastAsia="KlarMinTC GenKiMerriMix PunctFi" w:hAnsi="KlarMinTC GenKiMerriMix PunctFi"/>
-        </w:rPr>
-      </w:pPr>
-      <w:r>
-        <w:rPr>
-          <w:rFonts w:ascii="KlarMinTC GenKiMerriMix PunctFi" w:eastAsia="KlarMinTC GenKiMerriMix PunctFi" w:hAnsi="KlarMinTC GenKiMerriMix PunctFi"/>
-        </w:rPr>
-        <w:t xml:space="preserve">` </w:t>
-      </w:r>
-      <w:proofErr w:type="gramStart"/>
-      <w:r>
-        <w:rPr>
-          <w:rFonts w:ascii="新細明體" w:eastAsia="新細明體" w:hAnsi="新細明體" w:cs="新細明體" w:hint="eastAsia"/>
-        </w:rPr>
-        <w:t>｀</w:t>
-      </w:r>
-      <w:proofErr w:type="gramEnd"/>
-    </w:p>
-    <w:p>
-      <w:pPr>
-        <w:spacing w:after="0" w:line="0" w:lineRule="atLeast"/>
-        <w:rPr>
-          <w:rFonts w:ascii="KlarMinTC GenKiMerriMix PunctFi" w:eastAsia="KlarMinTC GenKiMerriMix PunctFi" w:hAnsi="KlarMinTC GenKiMerriMix PunctFi"/>
-        </w:rPr>
-      </w:pPr>
-      <w:r>
-        <w:rPr>
-          <w:rFonts w:ascii="KlarMinTC GenKiMerriMix PunctFi" w:eastAsia="KlarMinTC GenKiMerriMix PunctFi" w:hAnsi="KlarMinTC GenKiMerriMix PunctFi"/>
-        </w:rPr>
-        <w:t xml:space="preserve">&lt; </w:t>
-      </w:r>
-      <w:proofErr w:type="gramStart"/>
-      <w:r>
-        <w:rPr>
-          <w:rFonts w:ascii="KlarMinTC GenKiMerriMix PunctFi" w:eastAsia="KlarMinTC GenKiMerriMix PunctFi" w:hAnsi="KlarMinTC GenKiMerriMix PunctFi"/>
-        </w:rPr>
-        <w:t>〈</w:t>
-      </w:r>
-      <w:proofErr w:type="gramEnd"/>
-    </w:p>
-    <w:p>
-      <w:pPr>
-        <w:spacing w:after="0" w:line="0" w:lineRule="atLeast"/>
-        <w:rPr>
-          <w:rFonts w:ascii="KlarMinTC GenKiMerriMix PunctFi" w:eastAsia="KlarMinTC GenKiMerriMix PunctFi" w:hAnsi="KlarMinTC GenKiMerriMix PunctFi"/>
-        </w:rPr>
-      </w:pPr>
-      <w:r>
-        <w:rPr>
-          <w:rFonts w:ascii="KlarMinTC GenKiMerriMix PunctFi" w:eastAsia="KlarMinTC GenKiMerriMix PunctFi" w:hAnsi="KlarMinTC GenKiMerriMix PunctFi"/>
-        </w:rPr>
-        <w:t xml:space="preserve">&gt; </w:t>
-      </w:r>
-      <w:proofErr w:type="gramStart"/>
-      <w:r>
-        <w:rPr>
-          <w:rFonts w:ascii="KlarMinTC GenKiMerriMix PunctFi" w:eastAsia="KlarMinTC GenKiMerriMix PunctFi" w:hAnsi="KlarMinTC GenKiMerriMix PunctFi"/>
-        </w:rPr>
-        <w:t>〉</w:t>
-      </w:r>
-      <w:proofErr w:type="gramEnd"/>
     </w:p>
     <w:p>
       <w:pPr>
@@ -1163,7 +2397,6 @@
         <w:rPr>
           <w:rFonts w:ascii="KlarMinTC GenKiMerriMix PunctFi" w:eastAsia="KlarMinTC GenKiMerriMix PunctFi" w:hAnsi="KlarMinTC GenKiMerriMix PunctFi"/>
         </w:rPr>
-        <w:lastRenderedPageBreak/>
         <w:t>0123456789</w:t>
       </w:r>
     </w:p>

</xml_diff>